<commit_message>
Se eliminaron archivos de prueba y se creó el documento oficial de la bitácora
</commit_message>
<xml_diff>
--- a/Bitácora de trabajo.docx
+++ b/Bitácora de trabajo.docx
@@ -3,24 +3,556 @@
 <w:document xmlns:wpc="http://schemas.microsoft.com/office/word/2010/wordprocessingCanvas" xmlns:cx="http://schemas.microsoft.com/office/drawing/2014/chartex" xmlns:cx1="http://schemas.microsoft.com/office/drawing/2015/9/8/chartex" xmlns:cx2="http://schemas.microsoft.com/office/drawing/2015/10/21/chartex" xmlns:cx3="http://schemas.microsoft.com/office/drawing/2016/5/9/chartex" xmlns:cx4="http://schemas.microsoft.com/office/drawing/2016/5/10/chartex" xmlns:cx5="http://schemas.microsoft.com/office/drawing/2016/5/11/chartex" xmlns:cx6="http://schemas.microsoft.com/office/drawing/2016/5/12/chartex" xmlns:cx7="http://schemas.microsoft.com/office/drawing/2016/5/13/chartex" xmlns:cx8="http://schemas.microsoft.com/office/drawing/2016/5/14/chartex" xmlns:mc="http://schemas.openxmlformats.org/markup-compatibility/2006" xmlns:aink="http://schemas.microsoft.com/office/drawing/2016/ink" xmlns:am3d="http://schemas.microsoft.com/office/drawing/2017/model3d" xmlns:o="urn:schemas-microsoft-com:office:office" xmlns:r="http://schemas.openxmlformats.org/officeDocument/2006/relationships" xmlns:m="http://schemas.openxmlformats.org/officeDocument/2006/math" xmlns:v="urn:schemas-microsoft-com:vml" xmlns:wp14="http://schemas.microsoft.com/office/word/2010/wordprocessingDrawing" xmlns:wp="http://schemas.openxmlformats.org/drawingml/2006/wordprocessingDrawing" xmlns:w10="urn:schemas-microsoft-com:office:word" xmlns:w="http://schemas.openxmlformats.org/wordprocessingml/2006/main" xmlns:w14="http://schemas.microsoft.com/office/word/2010/wordml" xmlns:w15="http://schemas.microsoft.com/office/word/2012/wordml" xmlns:w16cex="http://schemas.microsoft.com/office/word/2018/wordml/cex" xmlns:w16cid="http://schemas.microsoft.com/office/word/2016/wordml/cid" xmlns:w16="http://schemas.microsoft.com/office/word/2018/wordml" xmlns:w16sdtdh="http://schemas.microsoft.com/office/word/2020/wordml/sdtdatahash" xmlns:w16se="http://schemas.microsoft.com/office/word/2015/wordml/symex" xmlns:wpg="http://schemas.microsoft.com/office/word/2010/wordprocessingGroup" xmlns:wpi="http://schemas.microsoft.com/office/word/2010/wordprocessingInk" xmlns:wne="http://schemas.microsoft.com/office/word/2006/wordml" xmlns:wps="http://schemas.microsoft.com/office/word/2010/wordprocessingShape" mc:Ignorable="w14 w15 w16se w16cid w16 w16cex w16sdtdh wp14">
   <w:body>
     <w:p>
+      <w:pPr>
+        <w:jc w:val="center"/>
+        <w:rPr>
+          <w:rFonts w:ascii="Arial" w:hAnsi="Arial" w:cs="Arial"/>
+          <w:b/>
+          <w:bCs/>
+          <w:sz w:val="28"/>
+          <w:szCs w:val="28"/>
+        </w:rPr>
+      </w:pPr>
       <w:r>
+        <w:rPr>
+          <w:rFonts w:ascii="Arial" w:hAnsi="Arial" w:cs="Arial"/>
+          <w:b/>
+          <w:bCs/>
+          <w:sz w:val="28"/>
+          <w:szCs w:val="28"/>
+        </w:rPr>
         <w:t>Bitácora de trabajo</w:t>
       </w:r>
     </w:p>
+    <w:p>
+      <w:pPr>
+        <w:jc w:val="center"/>
+        <w:rPr>
+          <w:rFonts w:ascii="Arial" w:hAnsi="Arial" w:cs="Arial"/>
+          <w:b/>
+          <w:bCs/>
+          <w:sz w:val="28"/>
+          <w:szCs w:val="28"/>
+        </w:rPr>
+      </w:pPr>
+    </w:p>
+    <w:p>
+      <w:pPr>
+        <w:jc w:val="center"/>
+        <w:rPr>
+          <w:rFonts w:ascii="Calisto MT" w:hAnsi="Calisto MT" w:cs="Arial"/>
+          <w:sz w:val="28"/>
+          <w:szCs w:val="28"/>
+        </w:rPr>
+      </w:pPr>
+      <w:r>
+        <w:rPr>
+          <w:rFonts w:ascii="Calisto MT" w:hAnsi="Calisto MT" w:cs="Arial"/>
+          <w:sz w:val="28"/>
+          <w:szCs w:val="28"/>
+        </w:rPr>
+        <w:t>Proyecto: Índice Ecológico</w:t>
+      </w:r>
+    </w:p>
+    <w:tbl>
+      <w:tblPr>
+        <w:tblStyle w:val="Tablaconcuadrcula"/>
+        <w:tblW w:w="10910" w:type="dxa"/>
+        <w:tblLook w:val="04A0" w:firstRow="1" w:lastRow="0" w:firstColumn="1" w:lastColumn="0" w:noHBand="0" w:noVBand="1"/>
+      </w:tblPr>
+      <w:tblGrid>
+        <w:gridCol w:w="951"/>
+        <w:gridCol w:w="1753"/>
+        <w:gridCol w:w="1237"/>
+        <w:gridCol w:w="1366"/>
+        <w:gridCol w:w="1365"/>
+        <w:gridCol w:w="1468"/>
+        <w:gridCol w:w="1351"/>
+        <w:gridCol w:w="1524"/>
+      </w:tblGrid>
+      <w:tr>
+        <w:tc>
+          <w:tcPr>
+            <w:tcW w:w="944" w:type="dxa"/>
+          </w:tcPr>
+          <w:p>
+            <w:pPr>
+              <w:jc w:val="center"/>
+              <w:rPr>
+                <w:rFonts w:ascii="Georgia" w:hAnsi="Georgia" w:cs="Arial"/>
+                <w:sz w:val="28"/>
+                <w:szCs w:val="28"/>
+              </w:rPr>
+            </w:pPr>
+            <w:r>
+              <w:rPr>
+                <w:rFonts w:ascii="Georgia" w:hAnsi="Georgia" w:cs="Arial"/>
+                <w:sz w:val="28"/>
+                <w:szCs w:val="28"/>
+              </w:rPr>
+              <w:t>Fecha</w:t>
+            </w:r>
+          </w:p>
+        </w:tc>
+        <w:tc>
+          <w:tcPr>
+            <w:tcW w:w="1739" w:type="dxa"/>
+          </w:tcPr>
+          <w:p>
+            <w:pPr>
+              <w:jc w:val="center"/>
+              <w:rPr>
+                <w:rFonts w:ascii="Calisto MT" w:hAnsi="Calisto MT" w:cs="Arial"/>
+                <w:sz w:val="28"/>
+                <w:szCs w:val="28"/>
+              </w:rPr>
+            </w:pPr>
+            <w:r>
+              <w:rPr>
+                <w:rFonts w:ascii="Calisto MT" w:hAnsi="Calisto MT" w:cs="Arial"/>
+                <w:sz w:val="28"/>
+                <w:szCs w:val="28"/>
+              </w:rPr>
+              <w:t>Participantes</w:t>
+            </w:r>
+          </w:p>
+        </w:tc>
+        <w:tc>
+          <w:tcPr>
+            <w:tcW w:w="1227" w:type="dxa"/>
+          </w:tcPr>
+          <w:p>
+            <w:pPr>
+              <w:jc w:val="center"/>
+              <w:rPr>
+                <w:rFonts w:ascii="Calisto MT" w:hAnsi="Calisto MT" w:cs="Arial"/>
+                <w:sz w:val="28"/>
+                <w:szCs w:val="28"/>
+              </w:rPr>
+            </w:pPr>
+            <w:r>
+              <w:rPr>
+                <w:rFonts w:ascii="Calisto MT" w:hAnsi="Calisto MT" w:cs="Arial"/>
+                <w:sz w:val="28"/>
+                <w:szCs w:val="28"/>
+              </w:rPr>
+              <w:t>Objetivo reunión</w:t>
+            </w:r>
+          </w:p>
+        </w:tc>
+        <w:tc>
+          <w:tcPr>
+            <w:tcW w:w="1355" w:type="dxa"/>
+          </w:tcPr>
+          <w:p>
+            <w:pPr>
+              <w:jc w:val="center"/>
+              <w:rPr>
+                <w:rFonts w:ascii="Calisto MT" w:hAnsi="Calisto MT" w:cs="Arial"/>
+                <w:sz w:val="28"/>
+                <w:szCs w:val="28"/>
+              </w:rPr>
+            </w:pPr>
+            <w:r>
+              <w:rPr>
+                <w:rFonts w:ascii="Calisto MT" w:hAnsi="Calisto MT" w:cs="Arial"/>
+                <w:sz w:val="28"/>
+                <w:szCs w:val="28"/>
+              </w:rPr>
+              <w:t>Tareas asignadas</w:t>
+            </w:r>
+          </w:p>
+        </w:tc>
+        <w:tc>
+          <w:tcPr>
+            <w:tcW w:w="1217" w:type="dxa"/>
+          </w:tcPr>
+          <w:p>
+            <w:pPr>
+              <w:jc w:val="center"/>
+              <w:rPr>
+                <w:rFonts w:ascii="Calisto MT" w:hAnsi="Calisto MT" w:cs="Arial"/>
+                <w:sz w:val="28"/>
+                <w:szCs w:val="28"/>
+              </w:rPr>
+            </w:pPr>
+            <w:r>
+              <w:rPr>
+                <w:rFonts w:ascii="Calisto MT" w:hAnsi="Calisto MT" w:cs="Arial"/>
+                <w:sz w:val="28"/>
+                <w:szCs w:val="28"/>
+              </w:rPr>
+              <w:t>Avances</w:t>
+            </w:r>
+          </w:p>
+        </w:tc>
+        <w:tc>
+          <w:tcPr>
+            <w:tcW w:w="1456" w:type="dxa"/>
+          </w:tcPr>
+          <w:p>
+            <w:pPr>
+              <w:jc w:val="center"/>
+              <w:rPr>
+                <w:rFonts w:ascii="Calisto MT" w:hAnsi="Calisto MT" w:cs="Arial"/>
+                <w:sz w:val="28"/>
+                <w:szCs w:val="28"/>
+              </w:rPr>
+            </w:pPr>
+            <w:r>
+              <w:rPr>
+                <w:rFonts w:ascii="Calisto MT" w:hAnsi="Calisto MT" w:cs="Arial"/>
+                <w:sz w:val="28"/>
+                <w:szCs w:val="28"/>
+              </w:rPr>
+              <w:t>Problemas</w:t>
+            </w:r>
+          </w:p>
+        </w:tc>
+        <w:tc>
+          <w:tcPr>
+            <w:tcW w:w="1340" w:type="dxa"/>
+          </w:tcPr>
+          <w:p>
+            <w:pPr>
+              <w:jc w:val="center"/>
+              <w:rPr>
+                <w:rFonts w:ascii="Calisto MT" w:hAnsi="Calisto MT" w:cs="Arial"/>
+                <w:sz w:val="28"/>
+                <w:szCs w:val="28"/>
+              </w:rPr>
+            </w:pPr>
+            <w:r>
+              <w:rPr>
+                <w:rFonts w:ascii="Calisto MT" w:hAnsi="Calisto MT" w:cs="Arial"/>
+                <w:sz w:val="28"/>
+                <w:szCs w:val="28"/>
+              </w:rPr>
+              <w:t>Acuerdos</w:t>
+            </w:r>
+          </w:p>
+        </w:tc>
+        <w:tc>
+          <w:tcPr>
+            <w:tcW w:w="1632" w:type="dxa"/>
+          </w:tcPr>
+          <w:p>
+            <w:pPr>
+              <w:jc w:val="center"/>
+              <w:rPr>
+                <w:rFonts w:ascii="Calisto MT" w:hAnsi="Calisto MT" w:cs="Arial"/>
+                <w:sz w:val="28"/>
+                <w:szCs w:val="28"/>
+              </w:rPr>
+            </w:pPr>
+            <w:r>
+              <w:rPr>
+                <w:rFonts w:ascii="Calisto MT" w:hAnsi="Calisto MT" w:cs="Arial"/>
+                <w:sz w:val="28"/>
+                <w:szCs w:val="28"/>
+              </w:rPr>
+              <w:t>Valoración Individual</w:t>
+            </w:r>
+          </w:p>
+        </w:tc>
+      </w:tr>
+      <w:tr>
+        <w:tc>
+          <w:tcPr>
+            <w:tcW w:w="944" w:type="dxa"/>
+          </w:tcPr>
+          <w:p>
+            <w:pPr>
+              <w:jc w:val="center"/>
+              <w:rPr>
+                <w:rFonts w:ascii="Cambria" w:hAnsi="Cambria" w:cs="Arial"/>
+                <w:sz w:val="24"/>
+                <w:szCs w:val="24"/>
+              </w:rPr>
+            </w:pPr>
+            <w:r>
+              <w:rPr>
+                <w:rFonts w:ascii="Cambria" w:hAnsi="Cambria" w:cs="Arial"/>
+                <w:sz w:val="24"/>
+                <w:szCs w:val="24"/>
+              </w:rPr>
+              <w:t>13-5</w:t>
+            </w:r>
+          </w:p>
+        </w:tc>
+        <w:tc>
+          <w:tcPr>
+            <w:tcW w:w="1739" w:type="dxa"/>
+          </w:tcPr>
+          <w:p>
+            <w:pPr>
+              <w:jc w:val="center"/>
+              <w:rPr>
+                <w:rFonts w:ascii="Cambria" w:hAnsi="Cambria" w:cs="Arial"/>
+                <w:sz w:val="24"/>
+                <w:szCs w:val="24"/>
+              </w:rPr>
+            </w:pPr>
+            <w:r>
+              <w:rPr>
+                <w:rFonts w:ascii="Cambria" w:hAnsi="Cambria" w:cs="Arial"/>
+                <w:sz w:val="24"/>
+                <w:szCs w:val="24"/>
+              </w:rPr>
+              <w:t>Allan</w:t>
+            </w:r>
+          </w:p>
+          <w:p>
+            <w:pPr>
+              <w:jc w:val="center"/>
+              <w:rPr>
+                <w:rFonts w:ascii="Cambria" w:hAnsi="Cambria" w:cs="Arial"/>
+                <w:sz w:val="24"/>
+                <w:szCs w:val="24"/>
+              </w:rPr>
+            </w:pPr>
+            <w:r>
+              <w:rPr>
+                <w:rFonts w:ascii="Cambria" w:hAnsi="Cambria" w:cs="Arial"/>
+                <w:sz w:val="24"/>
+                <w:szCs w:val="24"/>
+              </w:rPr>
+              <w:t>Carlos</w:t>
+            </w:r>
+          </w:p>
+          <w:p>
+            <w:pPr>
+              <w:jc w:val="center"/>
+              <w:rPr>
+                <w:rFonts w:ascii="Cambria" w:hAnsi="Cambria" w:cs="Arial"/>
+                <w:sz w:val="24"/>
+                <w:szCs w:val="24"/>
+              </w:rPr>
+            </w:pPr>
+            <w:r>
+              <w:rPr>
+                <w:rFonts w:ascii="Cambria" w:hAnsi="Cambria" w:cs="Arial"/>
+                <w:sz w:val="24"/>
+                <w:szCs w:val="24"/>
+              </w:rPr>
+              <w:t>Josimar</w:t>
+            </w:r>
+          </w:p>
+          <w:p>
+            <w:pPr>
+              <w:jc w:val="center"/>
+              <w:rPr>
+                <w:rFonts w:ascii="Cambria" w:hAnsi="Cambria" w:cs="Arial"/>
+                <w:sz w:val="24"/>
+                <w:szCs w:val="24"/>
+              </w:rPr>
+            </w:pPr>
+            <w:r>
+              <w:rPr>
+                <w:rFonts w:ascii="Cambria" w:hAnsi="Cambria" w:cs="Arial"/>
+                <w:sz w:val="24"/>
+                <w:szCs w:val="24"/>
+              </w:rPr>
+              <w:t>Jean Marco</w:t>
+            </w:r>
+          </w:p>
+          <w:p>
+            <w:pPr>
+              <w:jc w:val="center"/>
+              <w:rPr>
+                <w:rFonts w:ascii="Cambria" w:hAnsi="Cambria" w:cs="Arial"/>
+                <w:sz w:val="24"/>
+                <w:szCs w:val="24"/>
+              </w:rPr>
+            </w:pPr>
+            <w:r>
+              <w:rPr>
+                <w:rFonts w:ascii="Cambria" w:hAnsi="Cambria" w:cs="Arial"/>
+                <w:sz w:val="24"/>
+                <w:szCs w:val="24"/>
+              </w:rPr>
+              <w:t xml:space="preserve">Melvin </w:t>
+            </w:r>
+          </w:p>
+        </w:tc>
+        <w:tc>
+          <w:tcPr>
+            <w:tcW w:w="1227" w:type="dxa"/>
+          </w:tcPr>
+          <w:p>
+            <w:pPr>
+              <w:jc w:val="center"/>
+              <w:rPr>
+                <w:rFonts w:ascii="Cambria" w:hAnsi="Cambria" w:cs="Arial"/>
+                <w:sz w:val="24"/>
+                <w:szCs w:val="24"/>
+              </w:rPr>
+            </w:pPr>
+            <w:r>
+              <w:rPr>
+                <w:rFonts w:ascii="Cambria" w:hAnsi="Cambria" w:cs="Arial"/>
+                <w:sz w:val="24"/>
+                <w:szCs w:val="24"/>
+              </w:rPr>
+              <w:t>Iniciar el Git-Hub y tratar los errores, antes de empezar con el proyecto</w:t>
+            </w:r>
+          </w:p>
+        </w:tc>
+        <w:tc>
+          <w:tcPr>
+            <w:tcW w:w="1355" w:type="dxa"/>
+          </w:tcPr>
+          <w:p>
+            <w:pPr>
+              <w:jc w:val="center"/>
+              <w:rPr>
+                <w:rFonts w:ascii="Cambria" w:hAnsi="Cambria" w:cs="Arial"/>
+                <w:sz w:val="24"/>
+                <w:szCs w:val="24"/>
+              </w:rPr>
+            </w:pPr>
+            <w:r>
+              <w:rPr>
+                <w:rFonts w:ascii="Cambria" w:hAnsi="Cambria" w:cs="Arial"/>
+                <w:sz w:val="24"/>
+                <w:szCs w:val="24"/>
+              </w:rPr>
+              <w:t>El líder creó el repositorio mientras el resto del equipo apoyaba el proceso y se vinculaban</w:t>
+            </w:r>
+          </w:p>
+        </w:tc>
+        <w:tc>
+          <w:tcPr>
+            <w:tcW w:w="1217" w:type="dxa"/>
+          </w:tcPr>
+          <w:p>
+            <w:pPr>
+              <w:jc w:val="center"/>
+              <w:rPr>
+                <w:rFonts w:ascii="Cambria" w:hAnsi="Cambria" w:cs="Arial"/>
+                <w:sz w:val="24"/>
+                <w:szCs w:val="24"/>
+              </w:rPr>
+            </w:pPr>
+            <w:r>
+              <w:rPr>
+                <w:rFonts w:ascii="Cambria" w:hAnsi="Cambria" w:cs="Arial"/>
+                <w:sz w:val="24"/>
+                <w:szCs w:val="24"/>
+              </w:rPr>
+              <w:t>Se logró dejar el repositorio listo para el uso</w:t>
+            </w:r>
+          </w:p>
+        </w:tc>
+        <w:tc>
+          <w:tcPr>
+            <w:tcW w:w="1456" w:type="dxa"/>
+          </w:tcPr>
+          <w:p>
+            <w:pPr>
+              <w:jc w:val="center"/>
+              <w:rPr>
+                <w:rFonts w:ascii="Cambria" w:hAnsi="Cambria" w:cs="Arial"/>
+                <w:sz w:val="24"/>
+                <w:szCs w:val="24"/>
+              </w:rPr>
+            </w:pPr>
+            <w:r>
+              <w:rPr>
+                <w:rFonts w:ascii="Cambria" w:hAnsi="Cambria" w:cs="Arial"/>
+                <w:sz w:val="24"/>
+                <w:szCs w:val="24"/>
+              </w:rPr>
+              <w:t>Problemas con las cuentas de GitHub del líder y comandos mal escritos</w:t>
+            </w:r>
+          </w:p>
+        </w:tc>
+        <w:tc>
+          <w:tcPr>
+            <w:tcW w:w="1340" w:type="dxa"/>
+          </w:tcPr>
+          <w:p>
+            <w:pPr>
+              <w:jc w:val="center"/>
+              <w:rPr>
+                <w:rFonts w:ascii="Cambria" w:hAnsi="Cambria" w:cs="Arial"/>
+                <w:sz w:val="24"/>
+                <w:szCs w:val="24"/>
+              </w:rPr>
+            </w:pPr>
+            <w:r>
+              <w:rPr>
+                <w:rFonts w:ascii="Cambria" w:hAnsi="Cambria" w:cs="Arial"/>
+                <w:sz w:val="24"/>
+                <w:szCs w:val="24"/>
+              </w:rPr>
+              <w:t>Se logró solucionar los problemas del líder, todos lograron vincularse</w:t>
+            </w:r>
+          </w:p>
+        </w:tc>
+        <w:tc>
+          <w:tcPr>
+            <w:tcW w:w="1632" w:type="dxa"/>
+          </w:tcPr>
+          <w:p>
+            <w:pPr>
+              <w:jc w:val="center"/>
+              <w:rPr>
+                <w:rFonts w:ascii="Cambria" w:hAnsi="Cambria" w:cs="Arial"/>
+                <w:sz w:val="24"/>
+                <w:szCs w:val="24"/>
+              </w:rPr>
+            </w:pPr>
+            <w:r>
+              <w:rPr>
+                <w:rFonts w:ascii="Cambria" w:hAnsi="Cambria" w:cs="Arial"/>
+                <w:sz w:val="24"/>
+                <w:szCs w:val="24"/>
+              </w:rPr>
+              <w:t>Excelente/ Adecuada/ I</w:t>
+            </w:r>
+            <w:r>
+              <w:rPr>
+                <w:rFonts w:ascii="Cambria" w:hAnsi="Cambria" w:cs="Arial"/>
+                <w:sz w:val="24"/>
+                <w:szCs w:val="24"/>
+              </w:rPr>
+              <w:t>nsuficiente</w:t>
+            </w:r>
+          </w:p>
+          <w:p>
+            <w:pPr>
+              <w:jc w:val="center"/>
+              <w:rPr>
+                <w:rFonts w:ascii="Cambria" w:hAnsi="Cambria" w:cs="Arial"/>
+                <w:sz w:val="24"/>
+                <w:szCs w:val="24"/>
+              </w:rPr>
+            </w:pPr>
+          </w:p>
+          <w:p>
+            <w:pPr>
+              <w:jc w:val="center"/>
+              <w:rPr>
+                <w:rFonts w:ascii="Cambria" w:hAnsi="Cambria" w:cs="Arial"/>
+                <w:sz w:val="24"/>
+                <w:szCs w:val="24"/>
+              </w:rPr>
+            </w:pPr>
+            <w:r>
+              <w:rPr>
+                <w:rFonts w:ascii="Cambria" w:hAnsi="Cambria" w:cs="Arial"/>
+                <w:sz w:val="24"/>
+                <w:szCs w:val="24"/>
+              </w:rPr>
+              <w:t>En general el desempeño individual fue excelente, aporte y ayuda de todos y entre todos.</w:t>
+            </w:r>
+          </w:p>
+        </w:tc>
+      </w:tr>
+    </w:tbl>
     <w:p/>
     <w:p>
-      <w:r>
-        <w:t xml:space="preserve">13-5-2026 </w:t>
-      </w:r>
-      <w:r>
-        <w:br/>
-        <w:t xml:space="preserve">-Iniciamos creando el repositorio con las ramas, vinculándolo a las cuentas de todos </w:t>
-      </w:r>
-      <w:proofErr w:type="spellStart"/>
-      <w:r>
-        <w:t>uds</w:t>
-      </w:r>
-      <w:proofErr w:type="spellEnd"/>
       <w:r>
         <w:br/>
       </w:r>
@@ -28,7 +560,7 @@
     <w:p/>
     <w:sectPr>
       <w:pgSz w:w="12240" w:h="15840"/>
-      <w:pgMar w:top="1417" w:right="1701" w:bottom="1417" w:left="1701" w:header="708" w:footer="708" w:gutter="0"/>
+      <w:pgMar w:top="720" w:right="720" w:bottom="720" w:left="720" w:header="708" w:footer="708" w:gutter="0"/>
       <w:cols w:space="708"/>
       <w:docGrid w:linePitch="360"/>
     </w:sectPr>
@@ -462,6 +994,25 @@
     <w:semiHidden/>
     <w:unhideWhenUsed/>
   </w:style>
+  <w:style w:type="table" w:styleId="Tablaconcuadrcula">
+    <w:name w:val="Table Grid"/>
+    <w:basedOn w:val="Tablanormal"/>
+    <w:uiPriority w:val="39"/>
+    <w:rsid w:val="007D2B85"/>
+    <w:pPr>
+      <w:spacing w:after="0" w:line="240" w:lineRule="auto"/>
+    </w:pPr>
+    <w:tblPr>
+      <w:tblBorders>
+        <w:top w:val="single" w:sz="4" w:space="0" w:color="auto"/>
+        <w:left w:val="single" w:sz="4" w:space="0" w:color="auto"/>
+        <w:bottom w:val="single" w:sz="4" w:space="0" w:color="auto"/>
+        <w:right w:val="single" w:sz="4" w:space="0" w:color="auto"/>
+        <w:insideH w:val="single" w:sz="4" w:space="0" w:color="auto"/>
+        <w:insideV w:val="single" w:sz="4" w:space="0" w:color="auto"/>
+      </w:tblBorders>
+    </w:tblPr>
+  </w:style>
 </w:styles>
 </file>
 

</xml_diff>

<commit_message>
Actualizacion de la bitacora con 2 reuniones
</commit_message>
<xml_diff>
--- a/Bitácora de trabajo.docx
+++ b/Bitácora de trabajo.docx
@@ -57,23 +57,26 @@
     <w:tbl>
       <w:tblPr>
         <w:tblStyle w:val="Tablaconcuadrcula"/>
-        <w:tblW w:w="10910" w:type="dxa"/>
+        <w:tblW w:w="11035" w:type="dxa"/>
         <w:tblLook w:val="04A0" w:firstRow="1" w:lastRow="0" w:firstColumn="1" w:lastColumn="0" w:noHBand="0" w:noVBand="1"/>
       </w:tblPr>
       <w:tblGrid>
-        <w:gridCol w:w="951"/>
-        <w:gridCol w:w="1753"/>
-        <w:gridCol w:w="1237"/>
-        <w:gridCol w:w="1366"/>
-        <w:gridCol w:w="1365"/>
-        <w:gridCol w:w="1468"/>
-        <w:gridCol w:w="1351"/>
-        <w:gridCol w:w="1524"/>
+        <w:gridCol w:w="902"/>
+        <w:gridCol w:w="1650"/>
+        <w:gridCol w:w="1389"/>
+        <w:gridCol w:w="1551"/>
+        <w:gridCol w:w="1288"/>
+        <w:gridCol w:w="1544"/>
+        <w:gridCol w:w="1275"/>
+        <w:gridCol w:w="1437"/>
       </w:tblGrid>
       <w:tr>
-        <w:tc>
-          <w:tcPr>
-            <w:tcW w:w="944" w:type="dxa"/>
+        <w:trPr>
+          <w:trHeight w:val="644"/>
+        </w:trPr>
+        <w:tc>
+          <w:tcPr>
+            <w:tcW w:w="897" w:type="dxa"/>
           </w:tcPr>
           <w:p>
             <w:pPr>
@@ -96,7 +99,7 @@
         </w:tc>
         <w:tc>
           <w:tcPr>
-            <w:tcW w:w="1739" w:type="dxa"/>
+            <w:tcW w:w="1653" w:type="dxa"/>
           </w:tcPr>
           <w:p>
             <w:pPr>
@@ -119,7 +122,7 @@
         </w:tc>
         <w:tc>
           <w:tcPr>
-            <w:tcW w:w="1227" w:type="dxa"/>
+            <w:tcW w:w="1389" w:type="dxa"/>
           </w:tcPr>
           <w:p>
             <w:pPr>
@@ -142,7 +145,7 @@
         </w:tc>
         <w:tc>
           <w:tcPr>
-            <w:tcW w:w="1355" w:type="dxa"/>
+            <w:tcW w:w="1552" w:type="dxa"/>
           </w:tcPr>
           <w:p>
             <w:pPr>
@@ -165,7 +168,7 @@
         </w:tc>
         <w:tc>
           <w:tcPr>
-            <w:tcW w:w="1217" w:type="dxa"/>
+            <w:tcW w:w="1287" w:type="dxa"/>
           </w:tcPr>
           <w:p>
             <w:pPr>
@@ -188,7 +191,7 @@
         </w:tc>
         <w:tc>
           <w:tcPr>
-            <w:tcW w:w="1456" w:type="dxa"/>
+            <w:tcW w:w="1546" w:type="dxa"/>
           </w:tcPr>
           <w:p>
             <w:pPr>
@@ -211,7 +214,7 @@
         </w:tc>
         <w:tc>
           <w:tcPr>
-            <w:tcW w:w="1340" w:type="dxa"/>
+            <w:tcW w:w="1274" w:type="dxa"/>
           </w:tcPr>
           <w:p>
             <w:pPr>
@@ -234,7 +237,7 @@
         </w:tc>
         <w:tc>
           <w:tcPr>
-            <w:tcW w:w="1632" w:type="dxa"/>
+            <w:tcW w:w="1437" w:type="dxa"/>
           </w:tcPr>
           <w:p>
             <w:pPr>
@@ -257,9 +260,12 @@
         </w:tc>
       </w:tr>
       <w:tr>
-        <w:tc>
-          <w:tcPr>
-            <w:tcW w:w="944" w:type="dxa"/>
+        <w:trPr>
+          <w:trHeight w:val="3978"/>
+        </w:trPr>
+        <w:tc>
+          <w:tcPr>
+            <w:tcW w:w="897" w:type="dxa"/>
           </w:tcPr>
           <w:p>
             <w:pPr>
@@ -282,7 +288,7 @@
         </w:tc>
         <w:tc>
           <w:tcPr>
-            <w:tcW w:w="1739" w:type="dxa"/>
+            <w:tcW w:w="1653" w:type="dxa"/>
           </w:tcPr>
           <w:p>
             <w:pPr>
@@ -377,7 +383,7 @@
         </w:tc>
         <w:tc>
           <w:tcPr>
-            <w:tcW w:w="1227" w:type="dxa"/>
+            <w:tcW w:w="1389" w:type="dxa"/>
           </w:tcPr>
           <w:p>
             <w:pPr>
@@ -400,7 +406,7 @@
         </w:tc>
         <w:tc>
           <w:tcPr>
-            <w:tcW w:w="1355" w:type="dxa"/>
+            <w:tcW w:w="1552" w:type="dxa"/>
           </w:tcPr>
           <w:p>
             <w:pPr>
@@ -423,7 +429,7 @@
         </w:tc>
         <w:tc>
           <w:tcPr>
-            <w:tcW w:w="1217" w:type="dxa"/>
+            <w:tcW w:w="1287" w:type="dxa"/>
           </w:tcPr>
           <w:p>
             <w:pPr>
@@ -446,7 +452,7 @@
         </w:tc>
         <w:tc>
           <w:tcPr>
-            <w:tcW w:w="1456" w:type="dxa"/>
+            <w:tcW w:w="1546" w:type="dxa"/>
           </w:tcPr>
           <w:p>
             <w:pPr>
@@ -469,7 +475,7 @@
         </w:tc>
         <w:tc>
           <w:tcPr>
-            <w:tcW w:w="1340" w:type="dxa"/>
+            <w:tcW w:w="1274" w:type="dxa"/>
           </w:tcPr>
           <w:p>
             <w:pPr>
@@ -492,7 +498,7 @@
         </w:tc>
         <w:tc>
           <w:tcPr>
-            <w:tcW w:w="1632" w:type="dxa"/>
+            <w:tcW w:w="1437" w:type="dxa"/>
           </w:tcPr>
           <w:p>
             <w:pPr>
@@ -546,6 +552,530 @@
                 <w:szCs w:val="24"/>
               </w:rPr>
               <w:t>En general el desempeño individual fue excelente, aporte y ayuda de todos y entre todos.</w:t>
+            </w:r>
+          </w:p>
+        </w:tc>
+      </w:tr>
+      <w:tr>
+        <w:trPr>
+          <w:trHeight w:val="3120"/>
+        </w:trPr>
+        <w:tc>
+          <w:tcPr>
+            <w:tcW w:w="897" w:type="dxa"/>
+          </w:tcPr>
+          <w:p>
+            <w:pPr>
+              <w:jc w:val="center"/>
+              <w:rPr>
+                <w:rFonts w:ascii="Cambria" w:hAnsi="Cambria" w:cs="Arial"/>
+                <w:sz w:val="24"/>
+                <w:szCs w:val="24"/>
+              </w:rPr>
+            </w:pPr>
+            <w:r>
+              <w:rPr>
+                <w:rFonts w:ascii="Cambria" w:hAnsi="Cambria" w:cs="Arial"/>
+                <w:sz w:val="24"/>
+                <w:szCs w:val="24"/>
+              </w:rPr>
+              <w:t>18-5</w:t>
+            </w:r>
+          </w:p>
+        </w:tc>
+        <w:tc>
+          <w:tcPr>
+            <w:tcW w:w="1653" w:type="dxa"/>
+          </w:tcPr>
+          <w:p>
+            <w:pPr>
+              <w:jc w:val="center"/>
+              <w:rPr>
+                <w:rFonts w:ascii="Cambria" w:hAnsi="Cambria" w:cs="Arial"/>
+                <w:sz w:val="24"/>
+                <w:szCs w:val="24"/>
+              </w:rPr>
+            </w:pPr>
+            <w:r>
+              <w:rPr>
+                <w:rFonts w:ascii="Cambria" w:hAnsi="Cambria" w:cs="Arial"/>
+                <w:sz w:val="24"/>
+                <w:szCs w:val="24"/>
+              </w:rPr>
+              <w:t>Allan</w:t>
+            </w:r>
+          </w:p>
+          <w:p>
+            <w:pPr>
+              <w:jc w:val="center"/>
+              <w:rPr>
+                <w:rFonts w:ascii="Cambria" w:hAnsi="Cambria" w:cs="Arial"/>
+                <w:sz w:val="24"/>
+                <w:szCs w:val="24"/>
+              </w:rPr>
+            </w:pPr>
+            <w:r>
+              <w:rPr>
+                <w:rFonts w:ascii="Cambria" w:hAnsi="Cambria" w:cs="Arial"/>
+                <w:sz w:val="24"/>
+                <w:szCs w:val="24"/>
+              </w:rPr>
+              <w:t>Carlos</w:t>
+            </w:r>
+          </w:p>
+          <w:p>
+            <w:pPr>
+              <w:jc w:val="center"/>
+              <w:rPr>
+                <w:rFonts w:ascii="Cambria" w:hAnsi="Cambria" w:cs="Arial"/>
+                <w:sz w:val="24"/>
+                <w:szCs w:val="24"/>
+              </w:rPr>
+            </w:pPr>
+            <w:r>
+              <w:rPr>
+                <w:rFonts w:ascii="Cambria" w:hAnsi="Cambria" w:cs="Arial"/>
+                <w:sz w:val="24"/>
+                <w:szCs w:val="24"/>
+              </w:rPr>
+              <w:t>Josimar</w:t>
+            </w:r>
+          </w:p>
+          <w:p>
+            <w:pPr>
+              <w:jc w:val="center"/>
+              <w:rPr>
+                <w:rFonts w:ascii="Cambria" w:hAnsi="Cambria" w:cs="Arial"/>
+                <w:sz w:val="24"/>
+                <w:szCs w:val="24"/>
+              </w:rPr>
+            </w:pPr>
+            <w:r>
+              <w:rPr>
+                <w:rFonts w:ascii="Cambria" w:hAnsi="Cambria" w:cs="Arial"/>
+                <w:sz w:val="24"/>
+                <w:szCs w:val="24"/>
+              </w:rPr>
+              <w:t>Jean Marco</w:t>
+            </w:r>
+          </w:p>
+          <w:p>
+            <w:pPr>
+              <w:jc w:val="center"/>
+              <w:rPr>
+                <w:rFonts w:ascii="Cambria" w:hAnsi="Cambria" w:cs="Arial"/>
+                <w:sz w:val="24"/>
+                <w:szCs w:val="24"/>
+              </w:rPr>
+            </w:pPr>
+            <w:r>
+              <w:rPr>
+                <w:rFonts w:ascii="Cambria" w:hAnsi="Cambria" w:cs="Arial"/>
+                <w:sz w:val="24"/>
+                <w:szCs w:val="24"/>
+              </w:rPr>
+              <w:t>Melvin</w:t>
+            </w:r>
+          </w:p>
+        </w:tc>
+        <w:tc>
+          <w:tcPr>
+            <w:tcW w:w="1389" w:type="dxa"/>
+          </w:tcPr>
+          <w:p>
+            <w:pPr>
+              <w:jc w:val="center"/>
+              <w:rPr>
+                <w:rFonts w:ascii="Cambria" w:hAnsi="Cambria" w:cs="Arial"/>
+                <w:sz w:val="24"/>
+                <w:szCs w:val="24"/>
+              </w:rPr>
+            </w:pPr>
+            <w:r>
+              <w:rPr>
+                <w:rFonts w:ascii="Cambria" w:hAnsi="Cambria" w:cs="Arial"/>
+                <w:sz w:val="24"/>
+                <w:szCs w:val="24"/>
+              </w:rPr>
+              <w:t>Aclarar y exponer los aportes individuales para la primera entrega del proyecto</w:t>
+            </w:r>
+          </w:p>
+        </w:tc>
+        <w:tc>
+          <w:tcPr>
+            <w:tcW w:w="1552" w:type="dxa"/>
+          </w:tcPr>
+          <w:p>
+            <w:pPr>
+              <w:jc w:val="center"/>
+              <w:rPr>
+                <w:rFonts w:ascii="Cambria" w:hAnsi="Cambria" w:cs="Arial"/>
+                <w:sz w:val="24"/>
+                <w:szCs w:val="24"/>
+              </w:rPr>
+            </w:pPr>
+            <w:r>
+              <w:rPr>
+                <w:rFonts w:ascii="Cambria" w:hAnsi="Cambria" w:cs="Arial"/>
+                <w:sz w:val="24"/>
+                <w:szCs w:val="24"/>
+              </w:rPr>
+              <w:t xml:space="preserve">Entre todos hablamos sobre el trabajo que se asignó de manera individual para la entrega, poniendo al tanto a todos </w:t>
+            </w:r>
+          </w:p>
+        </w:tc>
+        <w:tc>
+          <w:tcPr>
+            <w:tcW w:w="1287" w:type="dxa"/>
+          </w:tcPr>
+          <w:p>
+            <w:pPr>
+              <w:jc w:val="center"/>
+              <w:rPr>
+                <w:rFonts w:ascii="Cambria" w:hAnsi="Cambria" w:cs="Arial"/>
+                <w:sz w:val="24"/>
+                <w:szCs w:val="24"/>
+              </w:rPr>
+            </w:pPr>
+            <w:r>
+              <w:rPr>
+                <w:rFonts w:ascii="Cambria" w:hAnsi="Cambria" w:cs="Arial"/>
+                <w:sz w:val="24"/>
+                <w:szCs w:val="24"/>
+              </w:rPr>
+              <w:t>Se logró el primer avance del proyecto</w:t>
+            </w:r>
+          </w:p>
+        </w:tc>
+        <w:tc>
+          <w:tcPr>
+            <w:tcW w:w="1546" w:type="dxa"/>
+          </w:tcPr>
+          <w:p>
+            <w:pPr>
+              <w:jc w:val="center"/>
+              <w:rPr>
+                <w:rFonts w:ascii="Cambria" w:hAnsi="Cambria" w:cs="Arial"/>
+                <w:sz w:val="24"/>
+                <w:szCs w:val="24"/>
+              </w:rPr>
+            </w:pPr>
+            <w:r>
+              <w:rPr>
+                <w:rFonts w:ascii="Cambria" w:hAnsi="Cambria" w:cs="Arial"/>
+                <w:sz w:val="24"/>
+                <w:szCs w:val="24"/>
+              </w:rPr>
+              <w:t>Problemas menores con la comunicación general</w:t>
+            </w:r>
+          </w:p>
+        </w:tc>
+        <w:tc>
+          <w:tcPr>
+            <w:tcW w:w="1274" w:type="dxa"/>
+          </w:tcPr>
+          <w:p>
+            <w:pPr>
+              <w:jc w:val="center"/>
+              <w:rPr>
+                <w:rFonts w:ascii="Cambria" w:hAnsi="Cambria" w:cs="Arial"/>
+                <w:sz w:val="24"/>
+                <w:szCs w:val="24"/>
+              </w:rPr>
+            </w:pPr>
+            <w:r>
+              <w:rPr>
+                <w:rFonts w:ascii="Cambria" w:hAnsi="Cambria" w:cs="Arial"/>
+                <w:sz w:val="24"/>
+                <w:szCs w:val="24"/>
+              </w:rPr>
+              <w:t>Logramos todos entender y tener claro el rumbo del proyecto al futuro</w:t>
+            </w:r>
+          </w:p>
+        </w:tc>
+        <w:tc>
+          <w:tcPr>
+            <w:tcW w:w="1437" w:type="dxa"/>
+          </w:tcPr>
+          <w:p>
+            <w:pPr>
+              <w:jc w:val="center"/>
+              <w:rPr>
+                <w:rFonts w:ascii="Cambria" w:hAnsi="Cambria" w:cs="Arial"/>
+                <w:sz w:val="24"/>
+                <w:szCs w:val="24"/>
+              </w:rPr>
+            </w:pPr>
+            <w:r>
+              <w:rPr>
+                <w:rFonts w:ascii="Cambria" w:hAnsi="Cambria" w:cs="Arial"/>
+                <w:sz w:val="24"/>
+                <w:szCs w:val="24"/>
+              </w:rPr>
+              <w:t>Excelente/ Adecuada/ I</w:t>
+            </w:r>
+            <w:r>
+              <w:rPr>
+                <w:rFonts w:ascii="Cambria" w:hAnsi="Cambria" w:cs="Arial"/>
+                <w:sz w:val="24"/>
+                <w:szCs w:val="24"/>
+              </w:rPr>
+              <w:t>nsuficiente</w:t>
+            </w:r>
+          </w:p>
+          <w:p>
+            <w:pPr>
+              <w:jc w:val="center"/>
+              <w:rPr>
+                <w:rFonts w:ascii="Cambria" w:hAnsi="Cambria" w:cs="Arial"/>
+                <w:sz w:val="24"/>
+                <w:szCs w:val="24"/>
+              </w:rPr>
+            </w:pPr>
+          </w:p>
+          <w:p>
+            <w:pPr>
+              <w:jc w:val="center"/>
+              <w:rPr>
+                <w:rFonts w:ascii="Cambria" w:hAnsi="Cambria" w:cs="Arial"/>
+                <w:sz w:val="24"/>
+                <w:szCs w:val="24"/>
+              </w:rPr>
+            </w:pPr>
+            <w:r>
+              <w:rPr>
+                <w:rFonts w:ascii="Cambria" w:hAnsi="Cambria" w:cs="Arial"/>
+                <w:sz w:val="24"/>
+                <w:szCs w:val="24"/>
+              </w:rPr>
+              <w:t>El desempeño general del equipo se califica en excelente</w:t>
+            </w:r>
+          </w:p>
+        </w:tc>
+      </w:tr>
+      <w:tr>
+        <w:trPr>
+          <w:trHeight w:val="3676"/>
+        </w:trPr>
+        <w:tc>
+          <w:tcPr>
+            <w:tcW w:w="897" w:type="dxa"/>
+          </w:tcPr>
+          <w:p>
+            <w:pPr>
+              <w:jc w:val="center"/>
+              <w:rPr>
+                <w:rFonts w:ascii="Cambria" w:hAnsi="Cambria" w:cs="Arial"/>
+                <w:sz w:val="24"/>
+                <w:szCs w:val="24"/>
+              </w:rPr>
+            </w:pPr>
+            <w:r>
+              <w:rPr>
+                <w:rFonts w:ascii="Cambria" w:hAnsi="Cambria" w:cs="Arial"/>
+                <w:sz w:val="24"/>
+                <w:szCs w:val="24"/>
+              </w:rPr>
+              <w:t>19-5</w:t>
+            </w:r>
+          </w:p>
+        </w:tc>
+        <w:tc>
+          <w:tcPr>
+            <w:tcW w:w="1653" w:type="dxa"/>
+          </w:tcPr>
+          <w:p>
+            <w:pPr>
+              <w:jc w:val="center"/>
+              <w:rPr>
+                <w:rFonts w:ascii="Cambria" w:hAnsi="Cambria" w:cs="Arial"/>
+                <w:sz w:val="24"/>
+                <w:szCs w:val="24"/>
+              </w:rPr>
+            </w:pPr>
+            <w:r>
+              <w:rPr>
+                <w:rFonts w:ascii="Cambria" w:hAnsi="Cambria" w:cs="Arial"/>
+                <w:sz w:val="24"/>
+                <w:szCs w:val="24"/>
+              </w:rPr>
+              <w:t>Allan</w:t>
+            </w:r>
+          </w:p>
+          <w:p>
+            <w:pPr>
+              <w:jc w:val="center"/>
+              <w:rPr>
+                <w:rFonts w:ascii="Cambria" w:hAnsi="Cambria" w:cs="Arial"/>
+                <w:sz w:val="24"/>
+                <w:szCs w:val="24"/>
+              </w:rPr>
+            </w:pPr>
+            <w:r>
+              <w:rPr>
+                <w:rFonts w:ascii="Cambria" w:hAnsi="Cambria" w:cs="Arial"/>
+                <w:sz w:val="24"/>
+                <w:szCs w:val="24"/>
+              </w:rPr>
+              <w:t>Carlos</w:t>
+            </w:r>
+          </w:p>
+          <w:p>
+            <w:pPr>
+              <w:jc w:val="center"/>
+              <w:rPr>
+                <w:rFonts w:ascii="Cambria" w:hAnsi="Cambria" w:cs="Arial"/>
+                <w:sz w:val="24"/>
+                <w:szCs w:val="24"/>
+              </w:rPr>
+            </w:pPr>
+            <w:r>
+              <w:rPr>
+                <w:rFonts w:ascii="Cambria" w:hAnsi="Cambria" w:cs="Arial"/>
+                <w:sz w:val="24"/>
+                <w:szCs w:val="24"/>
+              </w:rPr>
+              <w:t>Josimar</w:t>
+            </w:r>
+          </w:p>
+          <w:p>
+            <w:pPr>
+              <w:jc w:val="center"/>
+              <w:rPr>
+                <w:rFonts w:ascii="Cambria" w:hAnsi="Cambria" w:cs="Arial"/>
+                <w:sz w:val="24"/>
+                <w:szCs w:val="24"/>
+              </w:rPr>
+            </w:pPr>
+            <w:r>
+              <w:rPr>
+                <w:rFonts w:ascii="Cambria" w:hAnsi="Cambria" w:cs="Arial"/>
+                <w:sz w:val="24"/>
+                <w:szCs w:val="24"/>
+              </w:rPr>
+              <w:t>Jean Marco</w:t>
+            </w:r>
+          </w:p>
+        </w:tc>
+        <w:tc>
+          <w:tcPr>
+            <w:tcW w:w="1389" w:type="dxa"/>
+          </w:tcPr>
+          <w:p>
+            <w:pPr>
+              <w:jc w:val="center"/>
+              <w:rPr>
+                <w:rFonts w:ascii="Cambria" w:hAnsi="Cambria" w:cs="Arial"/>
+                <w:sz w:val="24"/>
+                <w:szCs w:val="24"/>
+              </w:rPr>
+            </w:pPr>
+            <w:r>
+              <w:rPr>
+                <w:rFonts w:ascii="Cambria" w:hAnsi="Cambria" w:cs="Arial"/>
+                <w:sz w:val="24"/>
+                <w:szCs w:val="24"/>
+              </w:rPr>
+              <w:t>Iniciar con el proyecto en IntelliJ</w:t>
+            </w:r>
+          </w:p>
+        </w:tc>
+        <w:tc>
+          <w:tcPr>
+            <w:tcW w:w="1552" w:type="dxa"/>
+          </w:tcPr>
+          <w:p>
+            <w:pPr>
+              <w:jc w:val="center"/>
+              <w:rPr>
+                <w:rFonts w:ascii="Cambria" w:hAnsi="Cambria" w:cs="Arial"/>
+                <w:sz w:val="24"/>
+                <w:szCs w:val="24"/>
+              </w:rPr>
+            </w:pPr>
+            <w:r>
+              <w:rPr>
+                <w:rFonts w:ascii="Cambria" w:hAnsi="Cambria" w:cs="Arial"/>
+                <w:sz w:val="24"/>
+                <w:szCs w:val="24"/>
+              </w:rPr>
+              <w:t>Entre el grupo se trabaja en la creación del proyecto con sus componentes, Jean Marco fue el encargado de crear el documento y subirlo</w:t>
+            </w:r>
+          </w:p>
+        </w:tc>
+        <w:tc>
+          <w:tcPr>
+            <w:tcW w:w="1287" w:type="dxa"/>
+          </w:tcPr>
+          <w:p>
+            <w:pPr>
+              <w:jc w:val="center"/>
+              <w:rPr>
+                <w:rFonts w:ascii="Cambria" w:hAnsi="Cambria" w:cs="Arial"/>
+                <w:sz w:val="24"/>
+                <w:szCs w:val="24"/>
+              </w:rPr>
+            </w:pPr>
+          </w:p>
+        </w:tc>
+        <w:tc>
+          <w:tcPr>
+            <w:tcW w:w="1546" w:type="dxa"/>
+          </w:tcPr>
+          <w:p>
+            <w:pPr>
+              <w:jc w:val="center"/>
+              <w:rPr>
+                <w:rFonts w:ascii="Cambria" w:hAnsi="Cambria" w:cs="Arial"/>
+                <w:sz w:val="24"/>
+                <w:szCs w:val="24"/>
+              </w:rPr>
+            </w:pPr>
+            <w:r>
+              <w:rPr>
+                <w:rFonts w:ascii="Cambria" w:hAnsi="Cambria" w:cs="Arial"/>
+                <w:sz w:val="24"/>
+                <w:szCs w:val="24"/>
+              </w:rPr>
+              <w:t>Falta de un integrante</w:t>
+            </w:r>
+          </w:p>
+        </w:tc>
+        <w:tc>
+          <w:tcPr>
+            <w:tcW w:w="1274" w:type="dxa"/>
+          </w:tcPr>
+          <w:p>
+            <w:pPr>
+              <w:jc w:val="center"/>
+              <w:rPr>
+                <w:rFonts w:ascii="Cambria" w:hAnsi="Cambria" w:cs="Arial"/>
+                <w:sz w:val="24"/>
+                <w:szCs w:val="24"/>
+              </w:rPr>
+            </w:pPr>
+          </w:p>
+        </w:tc>
+        <w:tc>
+          <w:tcPr>
+            <w:tcW w:w="1437" w:type="dxa"/>
+          </w:tcPr>
+          <w:p>
+            <w:pPr>
+              <w:jc w:val="center"/>
+              <w:rPr>
+                <w:rFonts w:ascii="Cambria" w:hAnsi="Cambria" w:cs="Arial"/>
+                <w:sz w:val="24"/>
+                <w:szCs w:val="24"/>
+              </w:rPr>
+            </w:pPr>
+            <w:r>
+              <w:rPr>
+                <w:rFonts w:ascii="Cambria" w:hAnsi="Cambria" w:cs="Arial"/>
+                <w:sz w:val="24"/>
+                <w:szCs w:val="24"/>
+              </w:rPr>
+              <w:t>El aporte de Jean fue excelente, el resto se califica como adecuado y Melvin queda en insuficiente, no se presentó</w:t>
             </w:r>
           </w:p>
         </w:tc>
@@ -560,7 +1090,7 @@
     <w:p/>
     <w:sectPr>
       <w:pgSz w:w="12240" w:h="15840"/>
-      <w:pgMar w:top="720" w:right="720" w:bottom="720" w:left="720" w:header="708" w:footer="708" w:gutter="0"/>
+      <w:pgMar w:top="720" w:right="474" w:bottom="720" w:left="720" w:header="708" w:footer="708" w:gutter="0"/>
       <w:cols w:space="708"/>
       <w:docGrid w:linePitch="360"/>
     </w:sectPr>
@@ -966,6 +1496,7 @@
   <w:style w:type="paragraph" w:default="1" w:styleId="Normal">
     <w:name w:val="Normal"/>
     <w:qFormat/>
+    <w:rsid w:val="003814A7"/>
   </w:style>
   <w:style w:type="character" w:default="1" w:styleId="Fuentedeprrafopredeter">
     <w:name w:val="Default Paragraph Font"/>

</xml_diff>

<commit_message>
Se actualizó la bitacora según la reunion del 25 de Mayo
</commit_message>
<xml_diff>
--- a/Bitácora de trabajo.docx
+++ b/Bitácora de trabajo.docx
@@ -61,14 +61,14 @@
         <w:tblLook w:val="04A0" w:firstRow="1" w:lastRow="0" w:firstColumn="1" w:lastColumn="0" w:noHBand="0" w:noVBand="1"/>
       </w:tblPr>
       <w:tblGrid>
-        <w:gridCol w:w="902"/>
-        <w:gridCol w:w="1650"/>
-        <w:gridCol w:w="1389"/>
-        <w:gridCol w:w="1551"/>
-        <w:gridCol w:w="1288"/>
-        <w:gridCol w:w="1544"/>
-        <w:gridCol w:w="1275"/>
-        <w:gridCol w:w="1437"/>
+        <w:gridCol w:w="893"/>
+        <w:gridCol w:w="1631"/>
+        <w:gridCol w:w="1373"/>
+        <w:gridCol w:w="1645"/>
+        <w:gridCol w:w="1274"/>
+        <w:gridCol w:w="1526"/>
+        <w:gridCol w:w="1274"/>
+        <w:gridCol w:w="1420"/>
       </w:tblGrid>
       <w:tr>
         <w:trPr>
@@ -1076,6 +1076,296 @@
                 <w:szCs w:val="24"/>
               </w:rPr>
               <w:t>El aporte de Jean fue excelente, el resto se califica como adecuado y Melvin queda en insuficiente, no se presentó</w:t>
+            </w:r>
+          </w:p>
+        </w:tc>
+      </w:tr>
+      <w:tr>
+        <w:trPr>
+          <w:trHeight w:val="3676"/>
+        </w:trPr>
+        <w:tc>
+          <w:tcPr>
+            <w:tcW w:w="897" w:type="dxa"/>
+          </w:tcPr>
+          <w:p>
+            <w:pPr>
+              <w:jc w:val="center"/>
+              <w:rPr>
+                <w:rFonts w:ascii="Cambria" w:hAnsi="Cambria" w:cs="Arial"/>
+                <w:sz w:val="24"/>
+                <w:szCs w:val="24"/>
+              </w:rPr>
+            </w:pPr>
+            <w:r>
+              <w:rPr>
+                <w:rFonts w:ascii="Cambria" w:hAnsi="Cambria" w:cs="Arial"/>
+                <w:sz w:val="24"/>
+                <w:szCs w:val="24"/>
+              </w:rPr>
+              <w:lastRenderedPageBreak/>
+              <w:t>25-5</w:t>
+            </w:r>
+          </w:p>
+        </w:tc>
+        <w:tc>
+          <w:tcPr>
+            <w:tcW w:w="1653" w:type="dxa"/>
+          </w:tcPr>
+          <w:p>
+            <w:pPr>
+              <w:jc w:val="center"/>
+              <w:rPr>
+                <w:rFonts w:ascii="Cambria" w:hAnsi="Cambria" w:cs="Arial"/>
+                <w:sz w:val="24"/>
+                <w:szCs w:val="24"/>
+              </w:rPr>
+            </w:pPr>
+            <w:r>
+              <w:rPr>
+                <w:rFonts w:ascii="Cambria" w:hAnsi="Cambria" w:cs="Arial"/>
+                <w:sz w:val="24"/>
+                <w:szCs w:val="24"/>
+              </w:rPr>
+              <w:t>Josimar</w:t>
+            </w:r>
+          </w:p>
+          <w:p>
+            <w:pPr>
+              <w:jc w:val="center"/>
+              <w:rPr>
+                <w:rFonts w:ascii="Cambria" w:hAnsi="Cambria" w:cs="Arial"/>
+                <w:sz w:val="24"/>
+                <w:szCs w:val="24"/>
+              </w:rPr>
+            </w:pPr>
+            <w:r>
+              <w:rPr>
+                <w:rFonts w:ascii="Cambria" w:hAnsi="Cambria" w:cs="Arial"/>
+                <w:sz w:val="24"/>
+                <w:szCs w:val="24"/>
+              </w:rPr>
+              <w:t>Carlos</w:t>
+            </w:r>
+          </w:p>
+          <w:p>
+            <w:pPr>
+              <w:jc w:val="center"/>
+              <w:rPr>
+                <w:rFonts w:ascii="Cambria" w:hAnsi="Cambria" w:cs="Arial"/>
+                <w:sz w:val="24"/>
+                <w:szCs w:val="24"/>
+              </w:rPr>
+            </w:pPr>
+            <w:r>
+              <w:rPr>
+                <w:rFonts w:ascii="Cambria" w:hAnsi="Cambria" w:cs="Arial"/>
+                <w:sz w:val="24"/>
+                <w:szCs w:val="24"/>
+              </w:rPr>
+              <w:t xml:space="preserve">Allan </w:t>
+            </w:r>
+          </w:p>
+          <w:p>
+            <w:pPr>
+              <w:jc w:val="center"/>
+              <w:rPr>
+                <w:rFonts w:ascii="Cambria" w:hAnsi="Cambria" w:cs="Arial"/>
+                <w:sz w:val="24"/>
+                <w:szCs w:val="24"/>
+              </w:rPr>
+            </w:pPr>
+            <w:r>
+              <w:rPr>
+                <w:rFonts w:ascii="Cambria" w:hAnsi="Cambria" w:cs="Arial"/>
+                <w:sz w:val="24"/>
+                <w:szCs w:val="24"/>
+              </w:rPr>
+              <w:t>Melvin</w:t>
+            </w:r>
+          </w:p>
+          <w:p>
+            <w:pPr>
+              <w:jc w:val="center"/>
+              <w:rPr>
+                <w:rFonts w:ascii="Cambria" w:hAnsi="Cambria" w:cs="Arial"/>
+                <w:sz w:val="24"/>
+                <w:szCs w:val="24"/>
+              </w:rPr>
+            </w:pPr>
+            <w:r>
+              <w:rPr>
+                <w:rFonts w:ascii="Cambria" w:hAnsi="Cambria" w:cs="Arial"/>
+                <w:sz w:val="24"/>
+                <w:szCs w:val="24"/>
+              </w:rPr>
+              <w:t>Jean Marco</w:t>
+            </w:r>
+          </w:p>
+        </w:tc>
+        <w:tc>
+          <w:tcPr>
+            <w:tcW w:w="1389" w:type="dxa"/>
+          </w:tcPr>
+          <w:p>
+            <w:pPr>
+              <w:jc w:val="center"/>
+              <w:rPr>
+                <w:rFonts w:ascii="Cambria" w:hAnsi="Cambria" w:cs="Arial"/>
+                <w:sz w:val="24"/>
+                <w:szCs w:val="24"/>
+              </w:rPr>
+            </w:pPr>
+            <w:r>
+              <w:rPr>
+                <w:rFonts w:ascii="Cambria" w:hAnsi="Cambria" w:cs="Arial"/>
+                <w:sz w:val="24"/>
+                <w:szCs w:val="24"/>
+              </w:rPr>
+              <w:t>Crear las bases del Backend de los 3 módulos del proyecto</w:t>
+            </w:r>
+          </w:p>
+        </w:tc>
+        <w:tc>
+          <w:tcPr>
+            <w:tcW w:w="1552" w:type="dxa"/>
+          </w:tcPr>
+          <w:p>
+            <w:pPr>
+              <w:jc w:val="center"/>
+              <w:rPr>
+                <w:rFonts w:ascii="Cambria" w:hAnsi="Cambria" w:cs="Arial"/>
+                <w:sz w:val="24"/>
+                <w:szCs w:val="24"/>
+              </w:rPr>
+            </w:pPr>
+            <w:r>
+              <w:rPr>
+                <w:rFonts w:ascii="Cambria" w:hAnsi="Cambria" w:cs="Arial"/>
+                <w:sz w:val="24"/>
+                <w:szCs w:val="24"/>
+              </w:rPr>
+              <w:t>Jean Marco debido a compromisos deportivos se encargó de supervisar que los compañeros hicieran el trabajo correctamente. Jossimar, Carlos y Melvin escribieron el backend de cada módulo, Allan supervisó todo generalmente y ayudó en explicación de código. Carlos asesoró con el GitHub</w:t>
+            </w:r>
+          </w:p>
+        </w:tc>
+        <w:tc>
+          <w:tcPr>
+            <w:tcW w:w="1287" w:type="dxa"/>
+          </w:tcPr>
+          <w:p>
+            <w:pPr>
+              <w:jc w:val="center"/>
+              <w:rPr>
+                <w:rFonts w:ascii="Cambria" w:hAnsi="Cambria" w:cs="Arial"/>
+                <w:sz w:val="24"/>
+                <w:szCs w:val="24"/>
+              </w:rPr>
+            </w:pPr>
+            <w:r>
+              <w:rPr>
+                <w:rFonts w:ascii="Cambria" w:hAnsi="Cambria" w:cs="Arial"/>
+                <w:sz w:val="24"/>
+                <w:szCs w:val="24"/>
+              </w:rPr>
+              <w:t xml:space="preserve">Se logró el objetivo, avanzar con los métodos del buscar todo, buscar por nombre y añadir, en los 3 </w:t>
+            </w:r>
+            <w:proofErr w:type="spellStart"/>
+            <w:r>
+              <w:rPr>
+                <w:rFonts w:ascii="Cambria" w:hAnsi="Cambria" w:cs="Arial"/>
+                <w:sz w:val="24"/>
+                <w:szCs w:val="24"/>
+              </w:rPr>
+              <w:t>metodos</w:t>
+            </w:r>
+            <w:proofErr w:type="spellEnd"/>
+          </w:p>
+        </w:tc>
+        <w:tc>
+          <w:tcPr>
+            <w:tcW w:w="1546" w:type="dxa"/>
+          </w:tcPr>
+          <w:p>
+            <w:pPr>
+              <w:jc w:val="center"/>
+              <w:rPr>
+                <w:rFonts w:ascii="Cambria" w:hAnsi="Cambria" w:cs="Arial"/>
+                <w:sz w:val="24"/>
+                <w:szCs w:val="24"/>
+              </w:rPr>
+            </w:pPr>
+            <w:r>
+              <w:rPr>
+                <w:rFonts w:ascii="Cambria" w:hAnsi="Cambria" w:cs="Arial"/>
+                <w:sz w:val="24"/>
+                <w:szCs w:val="24"/>
+              </w:rPr>
+              <w:t>Un integrante tuvo que irse temprano y otro se conectó tarde</w:t>
+            </w:r>
+          </w:p>
+        </w:tc>
+        <w:tc>
+          <w:tcPr>
+            <w:tcW w:w="1274" w:type="dxa"/>
+          </w:tcPr>
+          <w:p>
+            <w:pPr>
+              <w:jc w:val="center"/>
+              <w:rPr>
+                <w:rFonts w:ascii="Cambria" w:hAnsi="Cambria" w:cs="Arial"/>
+                <w:sz w:val="24"/>
+                <w:szCs w:val="24"/>
+              </w:rPr>
+            </w:pPr>
+            <w:r>
+              <w:rPr>
+                <w:rFonts w:ascii="Cambria" w:hAnsi="Cambria" w:cs="Arial"/>
+                <w:sz w:val="24"/>
+                <w:szCs w:val="24"/>
+              </w:rPr>
+              <w:t>El repositorio se logró modificar y quedó excelente</w:t>
+            </w:r>
+          </w:p>
+        </w:tc>
+        <w:tc>
+          <w:tcPr>
+            <w:tcW w:w="1437" w:type="dxa"/>
+          </w:tcPr>
+          <w:p>
+            <w:pPr>
+              <w:jc w:val="center"/>
+              <w:rPr>
+                <w:rFonts w:ascii="Cambria" w:hAnsi="Cambria" w:cs="Arial"/>
+                <w:sz w:val="24"/>
+                <w:szCs w:val="24"/>
+              </w:rPr>
+            </w:pPr>
+            <w:r>
+              <w:rPr>
+                <w:rFonts w:ascii="Cambria" w:hAnsi="Cambria" w:cs="Arial"/>
+                <w:sz w:val="24"/>
+                <w:szCs w:val="24"/>
+              </w:rPr>
+              <w:t xml:space="preserve">El aporte de Jean Marco fue adecuado, el resto </w:t>
+            </w:r>
+            <w:proofErr w:type="gramStart"/>
+            <w:r>
+              <w:rPr>
+                <w:rFonts w:ascii="Cambria" w:hAnsi="Cambria" w:cs="Arial"/>
+                <w:sz w:val="24"/>
+                <w:szCs w:val="24"/>
+              </w:rPr>
+              <w:t>lo  hicieron</w:t>
+            </w:r>
+            <w:proofErr w:type="gramEnd"/>
+            <w:r>
+              <w:rPr>
+                <w:rFonts w:ascii="Cambria" w:hAnsi="Cambria" w:cs="Arial"/>
+                <w:sz w:val="24"/>
+                <w:szCs w:val="24"/>
+              </w:rPr>
+              <w:t xml:space="preserve"> en excelente</w:t>
             </w:r>
           </w:p>
         </w:tc>

</xml_diff>

<commit_message>
Eliminacion de archivos y mover documento de bitacora a rama fix
</commit_message>
<xml_diff>
--- a/Bitácora de trabajo.docx
+++ b/Bitácora de trabajo.docx
@@ -3,24 +3,1376 @@
 <w:document xmlns:wpc="http://schemas.microsoft.com/office/word/2010/wordprocessingCanvas" xmlns:cx="http://schemas.microsoft.com/office/drawing/2014/chartex" xmlns:cx1="http://schemas.microsoft.com/office/drawing/2015/9/8/chartex" xmlns:cx2="http://schemas.microsoft.com/office/drawing/2015/10/21/chartex" xmlns:cx3="http://schemas.microsoft.com/office/drawing/2016/5/9/chartex" xmlns:cx4="http://schemas.microsoft.com/office/drawing/2016/5/10/chartex" xmlns:cx5="http://schemas.microsoft.com/office/drawing/2016/5/11/chartex" xmlns:cx6="http://schemas.microsoft.com/office/drawing/2016/5/12/chartex" xmlns:cx7="http://schemas.microsoft.com/office/drawing/2016/5/13/chartex" xmlns:cx8="http://schemas.microsoft.com/office/drawing/2016/5/14/chartex" xmlns:mc="http://schemas.openxmlformats.org/markup-compatibility/2006" xmlns:aink="http://schemas.microsoft.com/office/drawing/2016/ink" xmlns:am3d="http://schemas.microsoft.com/office/drawing/2017/model3d" xmlns:o="urn:schemas-microsoft-com:office:office" xmlns:r="http://schemas.openxmlformats.org/officeDocument/2006/relationships" xmlns:m="http://schemas.openxmlformats.org/officeDocument/2006/math" xmlns:v="urn:schemas-microsoft-com:vml" xmlns:wp14="http://schemas.microsoft.com/office/word/2010/wordprocessingDrawing" xmlns:wp="http://schemas.openxmlformats.org/drawingml/2006/wordprocessingDrawing" xmlns:w10="urn:schemas-microsoft-com:office:word" xmlns:w="http://schemas.openxmlformats.org/wordprocessingml/2006/main" xmlns:w14="http://schemas.microsoft.com/office/word/2010/wordml" xmlns:w15="http://schemas.microsoft.com/office/word/2012/wordml" xmlns:w16cex="http://schemas.microsoft.com/office/word/2018/wordml/cex" xmlns:w16cid="http://schemas.microsoft.com/office/word/2016/wordml/cid" xmlns:w16="http://schemas.microsoft.com/office/word/2018/wordml" xmlns:w16sdtdh="http://schemas.microsoft.com/office/word/2020/wordml/sdtdatahash" xmlns:w16se="http://schemas.microsoft.com/office/word/2015/wordml/symex" xmlns:wpg="http://schemas.microsoft.com/office/word/2010/wordprocessingGroup" xmlns:wpi="http://schemas.microsoft.com/office/word/2010/wordprocessingInk" xmlns:wne="http://schemas.microsoft.com/office/word/2006/wordml" xmlns:wps="http://schemas.microsoft.com/office/word/2010/wordprocessingShape" mc:Ignorable="w14 w15 w16se w16cid w16 w16cex w16sdtdh wp14">
   <w:body>
     <w:p>
+      <w:pPr>
+        <w:jc w:val="center"/>
+        <w:rPr>
+          <w:rFonts w:ascii="Arial" w:hAnsi="Arial" w:cs="Arial"/>
+          <w:b/>
+          <w:bCs/>
+          <w:sz w:val="28"/>
+          <w:szCs w:val="28"/>
+        </w:rPr>
+      </w:pPr>
       <w:r>
+        <w:rPr>
+          <w:rFonts w:ascii="Arial" w:hAnsi="Arial" w:cs="Arial"/>
+          <w:b/>
+          <w:bCs/>
+          <w:sz w:val="28"/>
+          <w:szCs w:val="28"/>
+        </w:rPr>
         <w:t>Bitácora de trabajo</w:t>
       </w:r>
     </w:p>
+    <w:p>
+      <w:pPr>
+        <w:jc w:val="center"/>
+        <w:rPr>
+          <w:rFonts w:ascii="Arial" w:hAnsi="Arial" w:cs="Arial"/>
+          <w:b/>
+          <w:bCs/>
+          <w:sz w:val="28"/>
+          <w:szCs w:val="28"/>
+        </w:rPr>
+      </w:pPr>
+    </w:p>
+    <w:p>
+      <w:pPr>
+        <w:jc w:val="center"/>
+        <w:rPr>
+          <w:rFonts w:ascii="Calisto MT" w:hAnsi="Calisto MT" w:cs="Arial"/>
+          <w:sz w:val="28"/>
+          <w:szCs w:val="28"/>
+        </w:rPr>
+      </w:pPr>
+      <w:r>
+        <w:rPr>
+          <w:rFonts w:ascii="Calisto MT" w:hAnsi="Calisto MT" w:cs="Arial"/>
+          <w:sz w:val="28"/>
+          <w:szCs w:val="28"/>
+        </w:rPr>
+        <w:t>Proyecto: Índice Ecológico</w:t>
+      </w:r>
+    </w:p>
+    <w:tbl>
+      <w:tblPr>
+        <w:tblStyle w:val="Tablaconcuadrcula"/>
+        <w:tblW w:w="11035" w:type="dxa"/>
+        <w:tblLook w:val="04A0" w:firstRow="1" w:lastRow="0" w:firstColumn="1" w:lastColumn="0" w:noHBand="0" w:noVBand="1"/>
+      </w:tblPr>
+      <w:tblGrid>
+        <w:gridCol w:w="893"/>
+        <w:gridCol w:w="1631"/>
+        <w:gridCol w:w="1373"/>
+        <w:gridCol w:w="1645"/>
+        <w:gridCol w:w="1274"/>
+        <w:gridCol w:w="1526"/>
+        <w:gridCol w:w="1274"/>
+        <w:gridCol w:w="1420"/>
+      </w:tblGrid>
+      <w:tr>
+        <w:trPr>
+          <w:trHeight w:val="644"/>
+        </w:trPr>
+        <w:tc>
+          <w:tcPr>
+            <w:tcW w:w="897" w:type="dxa"/>
+          </w:tcPr>
+          <w:p>
+            <w:pPr>
+              <w:jc w:val="center"/>
+              <w:rPr>
+                <w:rFonts w:ascii="Georgia" w:hAnsi="Georgia" w:cs="Arial"/>
+                <w:sz w:val="28"/>
+                <w:szCs w:val="28"/>
+              </w:rPr>
+            </w:pPr>
+            <w:r>
+              <w:rPr>
+                <w:rFonts w:ascii="Georgia" w:hAnsi="Georgia" w:cs="Arial"/>
+                <w:sz w:val="28"/>
+                <w:szCs w:val="28"/>
+              </w:rPr>
+              <w:t>Fecha</w:t>
+            </w:r>
+          </w:p>
+        </w:tc>
+        <w:tc>
+          <w:tcPr>
+            <w:tcW w:w="1653" w:type="dxa"/>
+          </w:tcPr>
+          <w:p>
+            <w:pPr>
+              <w:jc w:val="center"/>
+              <w:rPr>
+                <w:rFonts w:ascii="Calisto MT" w:hAnsi="Calisto MT" w:cs="Arial"/>
+                <w:sz w:val="28"/>
+                <w:szCs w:val="28"/>
+              </w:rPr>
+            </w:pPr>
+            <w:r>
+              <w:rPr>
+                <w:rFonts w:ascii="Calisto MT" w:hAnsi="Calisto MT" w:cs="Arial"/>
+                <w:sz w:val="28"/>
+                <w:szCs w:val="28"/>
+              </w:rPr>
+              <w:t>Participantes</w:t>
+            </w:r>
+          </w:p>
+        </w:tc>
+        <w:tc>
+          <w:tcPr>
+            <w:tcW w:w="1389" w:type="dxa"/>
+          </w:tcPr>
+          <w:p>
+            <w:pPr>
+              <w:jc w:val="center"/>
+              <w:rPr>
+                <w:rFonts w:ascii="Calisto MT" w:hAnsi="Calisto MT" w:cs="Arial"/>
+                <w:sz w:val="28"/>
+                <w:szCs w:val="28"/>
+              </w:rPr>
+            </w:pPr>
+            <w:r>
+              <w:rPr>
+                <w:rFonts w:ascii="Calisto MT" w:hAnsi="Calisto MT" w:cs="Arial"/>
+                <w:sz w:val="28"/>
+                <w:szCs w:val="28"/>
+              </w:rPr>
+              <w:t>Objetivo reunión</w:t>
+            </w:r>
+          </w:p>
+        </w:tc>
+        <w:tc>
+          <w:tcPr>
+            <w:tcW w:w="1552" w:type="dxa"/>
+          </w:tcPr>
+          <w:p>
+            <w:pPr>
+              <w:jc w:val="center"/>
+              <w:rPr>
+                <w:rFonts w:ascii="Calisto MT" w:hAnsi="Calisto MT" w:cs="Arial"/>
+                <w:sz w:val="28"/>
+                <w:szCs w:val="28"/>
+              </w:rPr>
+            </w:pPr>
+            <w:r>
+              <w:rPr>
+                <w:rFonts w:ascii="Calisto MT" w:hAnsi="Calisto MT" w:cs="Arial"/>
+                <w:sz w:val="28"/>
+                <w:szCs w:val="28"/>
+              </w:rPr>
+              <w:t>Tareas asignadas</w:t>
+            </w:r>
+          </w:p>
+        </w:tc>
+        <w:tc>
+          <w:tcPr>
+            <w:tcW w:w="1287" w:type="dxa"/>
+          </w:tcPr>
+          <w:p>
+            <w:pPr>
+              <w:jc w:val="center"/>
+              <w:rPr>
+                <w:rFonts w:ascii="Calisto MT" w:hAnsi="Calisto MT" w:cs="Arial"/>
+                <w:sz w:val="28"/>
+                <w:szCs w:val="28"/>
+              </w:rPr>
+            </w:pPr>
+            <w:r>
+              <w:rPr>
+                <w:rFonts w:ascii="Calisto MT" w:hAnsi="Calisto MT" w:cs="Arial"/>
+                <w:sz w:val="28"/>
+                <w:szCs w:val="28"/>
+              </w:rPr>
+              <w:t>Avances</w:t>
+            </w:r>
+          </w:p>
+        </w:tc>
+        <w:tc>
+          <w:tcPr>
+            <w:tcW w:w="1546" w:type="dxa"/>
+          </w:tcPr>
+          <w:p>
+            <w:pPr>
+              <w:jc w:val="center"/>
+              <w:rPr>
+                <w:rFonts w:ascii="Calisto MT" w:hAnsi="Calisto MT" w:cs="Arial"/>
+                <w:sz w:val="28"/>
+                <w:szCs w:val="28"/>
+              </w:rPr>
+            </w:pPr>
+            <w:r>
+              <w:rPr>
+                <w:rFonts w:ascii="Calisto MT" w:hAnsi="Calisto MT" w:cs="Arial"/>
+                <w:sz w:val="28"/>
+                <w:szCs w:val="28"/>
+              </w:rPr>
+              <w:t>Problemas</w:t>
+            </w:r>
+          </w:p>
+        </w:tc>
+        <w:tc>
+          <w:tcPr>
+            <w:tcW w:w="1274" w:type="dxa"/>
+          </w:tcPr>
+          <w:p>
+            <w:pPr>
+              <w:jc w:val="center"/>
+              <w:rPr>
+                <w:rFonts w:ascii="Calisto MT" w:hAnsi="Calisto MT" w:cs="Arial"/>
+                <w:sz w:val="28"/>
+                <w:szCs w:val="28"/>
+              </w:rPr>
+            </w:pPr>
+            <w:r>
+              <w:rPr>
+                <w:rFonts w:ascii="Calisto MT" w:hAnsi="Calisto MT" w:cs="Arial"/>
+                <w:sz w:val="28"/>
+                <w:szCs w:val="28"/>
+              </w:rPr>
+              <w:t>Acuerdos</w:t>
+            </w:r>
+          </w:p>
+        </w:tc>
+        <w:tc>
+          <w:tcPr>
+            <w:tcW w:w="1437" w:type="dxa"/>
+          </w:tcPr>
+          <w:p>
+            <w:pPr>
+              <w:jc w:val="center"/>
+              <w:rPr>
+                <w:rFonts w:ascii="Calisto MT" w:hAnsi="Calisto MT" w:cs="Arial"/>
+                <w:sz w:val="28"/>
+                <w:szCs w:val="28"/>
+              </w:rPr>
+            </w:pPr>
+            <w:r>
+              <w:rPr>
+                <w:rFonts w:ascii="Calisto MT" w:hAnsi="Calisto MT" w:cs="Arial"/>
+                <w:sz w:val="28"/>
+                <w:szCs w:val="28"/>
+              </w:rPr>
+              <w:t>Valoración Individual</w:t>
+            </w:r>
+          </w:p>
+        </w:tc>
+      </w:tr>
+      <w:tr>
+        <w:trPr>
+          <w:trHeight w:val="3978"/>
+        </w:trPr>
+        <w:tc>
+          <w:tcPr>
+            <w:tcW w:w="897" w:type="dxa"/>
+          </w:tcPr>
+          <w:p>
+            <w:pPr>
+              <w:jc w:val="center"/>
+              <w:rPr>
+                <w:rFonts w:ascii="Cambria" w:hAnsi="Cambria" w:cs="Arial"/>
+                <w:sz w:val="24"/>
+                <w:szCs w:val="24"/>
+              </w:rPr>
+            </w:pPr>
+            <w:r>
+              <w:rPr>
+                <w:rFonts w:ascii="Cambria" w:hAnsi="Cambria" w:cs="Arial"/>
+                <w:sz w:val="24"/>
+                <w:szCs w:val="24"/>
+              </w:rPr>
+              <w:t>13-5</w:t>
+            </w:r>
+          </w:p>
+        </w:tc>
+        <w:tc>
+          <w:tcPr>
+            <w:tcW w:w="1653" w:type="dxa"/>
+          </w:tcPr>
+          <w:p>
+            <w:pPr>
+              <w:jc w:val="center"/>
+              <w:rPr>
+                <w:rFonts w:ascii="Cambria" w:hAnsi="Cambria" w:cs="Arial"/>
+                <w:sz w:val="24"/>
+                <w:szCs w:val="24"/>
+              </w:rPr>
+            </w:pPr>
+            <w:r>
+              <w:rPr>
+                <w:rFonts w:ascii="Cambria" w:hAnsi="Cambria" w:cs="Arial"/>
+                <w:sz w:val="24"/>
+                <w:szCs w:val="24"/>
+              </w:rPr>
+              <w:t>Allan</w:t>
+            </w:r>
+          </w:p>
+          <w:p>
+            <w:pPr>
+              <w:jc w:val="center"/>
+              <w:rPr>
+                <w:rFonts w:ascii="Cambria" w:hAnsi="Cambria" w:cs="Arial"/>
+                <w:sz w:val="24"/>
+                <w:szCs w:val="24"/>
+              </w:rPr>
+            </w:pPr>
+            <w:r>
+              <w:rPr>
+                <w:rFonts w:ascii="Cambria" w:hAnsi="Cambria" w:cs="Arial"/>
+                <w:sz w:val="24"/>
+                <w:szCs w:val="24"/>
+              </w:rPr>
+              <w:t>Carlos</w:t>
+            </w:r>
+          </w:p>
+          <w:p>
+            <w:pPr>
+              <w:jc w:val="center"/>
+              <w:rPr>
+                <w:rFonts w:ascii="Cambria" w:hAnsi="Cambria" w:cs="Arial"/>
+                <w:sz w:val="24"/>
+                <w:szCs w:val="24"/>
+              </w:rPr>
+            </w:pPr>
+            <w:r>
+              <w:rPr>
+                <w:rFonts w:ascii="Cambria" w:hAnsi="Cambria" w:cs="Arial"/>
+                <w:sz w:val="24"/>
+                <w:szCs w:val="24"/>
+              </w:rPr>
+              <w:t>Josimar</w:t>
+            </w:r>
+          </w:p>
+          <w:p>
+            <w:pPr>
+              <w:jc w:val="center"/>
+              <w:rPr>
+                <w:rFonts w:ascii="Cambria" w:hAnsi="Cambria" w:cs="Arial"/>
+                <w:sz w:val="24"/>
+                <w:szCs w:val="24"/>
+              </w:rPr>
+            </w:pPr>
+            <w:r>
+              <w:rPr>
+                <w:rFonts w:ascii="Cambria" w:hAnsi="Cambria" w:cs="Arial"/>
+                <w:sz w:val="24"/>
+                <w:szCs w:val="24"/>
+              </w:rPr>
+              <w:t>Jean Marco</w:t>
+            </w:r>
+          </w:p>
+          <w:p>
+            <w:pPr>
+              <w:jc w:val="center"/>
+              <w:rPr>
+                <w:rFonts w:ascii="Cambria" w:hAnsi="Cambria" w:cs="Arial"/>
+                <w:sz w:val="24"/>
+                <w:szCs w:val="24"/>
+              </w:rPr>
+            </w:pPr>
+            <w:r>
+              <w:rPr>
+                <w:rFonts w:ascii="Cambria" w:hAnsi="Cambria" w:cs="Arial"/>
+                <w:sz w:val="24"/>
+                <w:szCs w:val="24"/>
+              </w:rPr>
+              <w:t xml:space="preserve">Melvin </w:t>
+            </w:r>
+          </w:p>
+        </w:tc>
+        <w:tc>
+          <w:tcPr>
+            <w:tcW w:w="1389" w:type="dxa"/>
+          </w:tcPr>
+          <w:p>
+            <w:pPr>
+              <w:jc w:val="center"/>
+              <w:rPr>
+                <w:rFonts w:ascii="Cambria" w:hAnsi="Cambria" w:cs="Arial"/>
+                <w:sz w:val="24"/>
+                <w:szCs w:val="24"/>
+              </w:rPr>
+            </w:pPr>
+            <w:r>
+              <w:rPr>
+                <w:rFonts w:ascii="Cambria" w:hAnsi="Cambria" w:cs="Arial"/>
+                <w:sz w:val="24"/>
+                <w:szCs w:val="24"/>
+              </w:rPr>
+              <w:t>Iniciar el Git-Hub y tratar los errores, antes de empezar con el proyecto</w:t>
+            </w:r>
+          </w:p>
+        </w:tc>
+        <w:tc>
+          <w:tcPr>
+            <w:tcW w:w="1552" w:type="dxa"/>
+          </w:tcPr>
+          <w:p>
+            <w:pPr>
+              <w:jc w:val="center"/>
+              <w:rPr>
+                <w:rFonts w:ascii="Cambria" w:hAnsi="Cambria" w:cs="Arial"/>
+                <w:sz w:val="24"/>
+                <w:szCs w:val="24"/>
+              </w:rPr>
+            </w:pPr>
+            <w:r>
+              <w:rPr>
+                <w:rFonts w:ascii="Cambria" w:hAnsi="Cambria" w:cs="Arial"/>
+                <w:sz w:val="24"/>
+                <w:szCs w:val="24"/>
+              </w:rPr>
+              <w:t>El líder creó el repositorio mientras el resto del equipo apoyaba el proceso y se vinculaban</w:t>
+            </w:r>
+          </w:p>
+        </w:tc>
+        <w:tc>
+          <w:tcPr>
+            <w:tcW w:w="1287" w:type="dxa"/>
+          </w:tcPr>
+          <w:p>
+            <w:pPr>
+              <w:jc w:val="center"/>
+              <w:rPr>
+                <w:rFonts w:ascii="Cambria" w:hAnsi="Cambria" w:cs="Arial"/>
+                <w:sz w:val="24"/>
+                <w:szCs w:val="24"/>
+              </w:rPr>
+            </w:pPr>
+            <w:r>
+              <w:rPr>
+                <w:rFonts w:ascii="Cambria" w:hAnsi="Cambria" w:cs="Arial"/>
+                <w:sz w:val="24"/>
+                <w:szCs w:val="24"/>
+              </w:rPr>
+              <w:t>Se logró dejar el repositorio listo para el uso</w:t>
+            </w:r>
+          </w:p>
+        </w:tc>
+        <w:tc>
+          <w:tcPr>
+            <w:tcW w:w="1546" w:type="dxa"/>
+          </w:tcPr>
+          <w:p>
+            <w:pPr>
+              <w:jc w:val="center"/>
+              <w:rPr>
+                <w:rFonts w:ascii="Cambria" w:hAnsi="Cambria" w:cs="Arial"/>
+                <w:sz w:val="24"/>
+                <w:szCs w:val="24"/>
+              </w:rPr>
+            </w:pPr>
+            <w:r>
+              <w:rPr>
+                <w:rFonts w:ascii="Cambria" w:hAnsi="Cambria" w:cs="Arial"/>
+                <w:sz w:val="24"/>
+                <w:szCs w:val="24"/>
+              </w:rPr>
+              <w:t>Problemas con las cuentas de GitHub del líder y comandos mal escritos</w:t>
+            </w:r>
+          </w:p>
+        </w:tc>
+        <w:tc>
+          <w:tcPr>
+            <w:tcW w:w="1274" w:type="dxa"/>
+          </w:tcPr>
+          <w:p>
+            <w:pPr>
+              <w:jc w:val="center"/>
+              <w:rPr>
+                <w:rFonts w:ascii="Cambria" w:hAnsi="Cambria" w:cs="Arial"/>
+                <w:sz w:val="24"/>
+                <w:szCs w:val="24"/>
+              </w:rPr>
+            </w:pPr>
+            <w:r>
+              <w:rPr>
+                <w:rFonts w:ascii="Cambria" w:hAnsi="Cambria" w:cs="Arial"/>
+                <w:sz w:val="24"/>
+                <w:szCs w:val="24"/>
+              </w:rPr>
+              <w:t>Se logró solucionar los problemas del líder, todos lograron vincularse</w:t>
+            </w:r>
+          </w:p>
+        </w:tc>
+        <w:tc>
+          <w:tcPr>
+            <w:tcW w:w="1437" w:type="dxa"/>
+          </w:tcPr>
+          <w:p>
+            <w:pPr>
+              <w:jc w:val="center"/>
+              <w:rPr>
+                <w:rFonts w:ascii="Cambria" w:hAnsi="Cambria" w:cs="Arial"/>
+                <w:sz w:val="24"/>
+                <w:szCs w:val="24"/>
+              </w:rPr>
+            </w:pPr>
+            <w:r>
+              <w:rPr>
+                <w:rFonts w:ascii="Cambria" w:hAnsi="Cambria" w:cs="Arial"/>
+                <w:sz w:val="24"/>
+                <w:szCs w:val="24"/>
+              </w:rPr>
+              <w:t>Excelente/ Adecuada/ I</w:t>
+            </w:r>
+            <w:r>
+              <w:rPr>
+                <w:rFonts w:ascii="Cambria" w:hAnsi="Cambria" w:cs="Arial"/>
+                <w:sz w:val="24"/>
+                <w:szCs w:val="24"/>
+              </w:rPr>
+              <w:t>nsuficiente</w:t>
+            </w:r>
+          </w:p>
+          <w:p>
+            <w:pPr>
+              <w:jc w:val="center"/>
+              <w:rPr>
+                <w:rFonts w:ascii="Cambria" w:hAnsi="Cambria" w:cs="Arial"/>
+                <w:sz w:val="24"/>
+                <w:szCs w:val="24"/>
+              </w:rPr>
+            </w:pPr>
+          </w:p>
+          <w:p>
+            <w:pPr>
+              <w:jc w:val="center"/>
+              <w:rPr>
+                <w:rFonts w:ascii="Cambria" w:hAnsi="Cambria" w:cs="Arial"/>
+                <w:sz w:val="24"/>
+                <w:szCs w:val="24"/>
+              </w:rPr>
+            </w:pPr>
+            <w:r>
+              <w:rPr>
+                <w:rFonts w:ascii="Cambria" w:hAnsi="Cambria" w:cs="Arial"/>
+                <w:sz w:val="24"/>
+                <w:szCs w:val="24"/>
+              </w:rPr>
+              <w:t>En general el desempeño individual fue excelente, aporte y ayuda de todos y entre todos.</w:t>
+            </w:r>
+          </w:p>
+        </w:tc>
+      </w:tr>
+      <w:tr>
+        <w:trPr>
+          <w:trHeight w:val="3120"/>
+        </w:trPr>
+        <w:tc>
+          <w:tcPr>
+            <w:tcW w:w="897" w:type="dxa"/>
+          </w:tcPr>
+          <w:p>
+            <w:pPr>
+              <w:jc w:val="center"/>
+              <w:rPr>
+                <w:rFonts w:ascii="Cambria" w:hAnsi="Cambria" w:cs="Arial"/>
+                <w:sz w:val="24"/>
+                <w:szCs w:val="24"/>
+              </w:rPr>
+            </w:pPr>
+            <w:r>
+              <w:rPr>
+                <w:rFonts w:ascii="Cambria" w:hAnsi="Cambria" w:cs="Arial"/>
+                <w:sz w:val="24"/>
+                <w:szCs w:val="24"/>
+              </w:rPr>
+              <w:t>18-5</w:t>
+            </w:r>
+          </w:p>
+        </w:tc>
+        <w:tc>
+          <w:tcPr>
+            <w:tcW w:w="1653" w:type="dxa"/>
+          </w:tcPr>
+          <w:p>
+            <w:pPr>
+              <w:jc w:val="center"/>
+              <w:rPr>
+                <w:rFonts w:ascii="Cambria" w:hAnsi="Cambria" w:cs="Arial"/>
+                <w:sz w:val="24"/>
+                <w:szCs w:val="24"/>
+              </w:rPr>
+            </w:pPr>
+            <w:r>
+              <w:rPr>
+                <w:rFonts w:ascii="Cambria" w:hAnsi="Cambria" w:cs="Arial"/>
+                <w:sz w:val="24"/>
+                <w:szCs w:val="24"/>
+              </w:rPr>
+              <w:t>Allan</w:t>
+            </w:r>
+          </w:p>
+          <w:p>
+            <w:pPr>
+              <w:jc w:val="center"/>
+              <w:rPr>
+                <w:rFonts w:ascii="Cambria" w:hAnsi="Cambria" w:cs="Arial"/>
+                <w:sz w:val="24"/>
+                <w:szCs w:val="24"/>
+              </w:rPr>
+            </w:pPr>
+            <w:r>
+              <w:rPr>
+                <w:rFonts w:ascii="Cambria" w:hAnsi="Cambria" w:cs="Arial"/>
+                <w:sz w:val="24"/>
+                <w:szCs w:val="24"/>
+              </w:rPr>
+              <w:t>Carlos</w:t>
+            </w:r>
+          </w:p>
+          <w:p>
+            <w:pPr>
+              <w:jc w:val="center"/>
+              <w:rPr>
+                <w:rFonts w:ascii="Cambria" w:hAnsi="Cambria" w:cs="Arial"/>
+                <w:sz w:val="24"/>
+                <w:szCs w:val="24"/>
+              </w:rPr>
+            </w:pPr>
+            <w:r>
+              <w:rPr>
+                <w:rFonts w:ascii="Cambria" w:hAnsi="Cambria" w:cs="Arial"/>
+                <w:sz w:val="24"/>
+                <w:szCs w:val="24"/>
+              </w:rPr>
+              <w:t>Josimar</w:t>
+            </w:r>
+          </w:p>
+          <w:p>
+            <w:pPr>
+              <w:jc w:val="center"/>
+              <w:rPr>
+                <w:rFonts w:ascii="Cambria" w:hAnsi="Cambria" w:cs="Arial"/>
+                <w:sz w:val="24"/>
+                <w:szCs w:val="24"/>
+              </w:rPr>
+            </w:pPr>
+            <w:r>
+              <w:rPr>
+                <w:rFonts w:ascii="Cambria" w:hAnsi="Cambria" w:cs="Arial"/>
+                <w:sz w:val="24"/>
+                <w:szCs w:val="24"/>
+              </w:rPr>
+              <w:t>Jean Marco</w:t>
+            </w:r>
+          </w:p>
+          <w:p>
+            <w:pPr>
+              <w:jc w:val="center"/>
+              <w:rPr>
+                <w:rFonts w:ascii="Cambria" w:hAnsi="Cambria" w:cs="Arial"/>
+                <w:sz w:val="24"/>
+                <w:szCs w:val="24"/>
+              </w:rPr>
+            </w:pPr>
+            <w:r>
+              <w:rPr>
+                <w:rFonts w:ascii="Cambria" w:hAnsi="Cambria" w:cs="Arial"/>
+                <w:sz w:val="24"/>
+                <w:szCs w:val="24"/>
+              </w:rPr>
+              <w:t>Melvin</w:t>
+            </w:r>
+          </w:p>
+        </w:tc>
+        <w:tc>
+          <w:tcPr>
+            <w:tcW w:w="1389" w:type="dxa"/>
+          </w:tcPr>
+          <w:p>
+            <w:pPr>
+              <w:jc w:val="center"/>
+              <w:rPr>
+                <w:rFonts w:ascii="Cambria" w:hAnsi="Cambria" w:cs="Arial"/>
+                <w:sz w:val="24"/>
+                <w:szCs w:val="24"/>
+              </w:rPr>
+            </w:pPr>
+            <w:r>
+              <w:rPr>
+                <w:rFonts w:ascii="Cambria" w:hAnsi="Cambria" w:cs="Arial"/>
+                <w:sz w:val="24"/>
+                <w:szCs w:val="24"/>
+              </w:rPr>
+              <w:t>Aclarar y exponer los aportes individuales para la primera entrega del proyecto</w:t>
+            </w:r>
+          </w:p>
+        </w:tc>
+        <w:tc>
+          <w:tcPr>
+            <w:tcW w:w="1552" w:type="dxa"/>
+          </w:tcPr>
+          <w:p>
+            <w:pPr>
+              <w:jc w:val="center"/>
+              <w:rPr>
+                <w:rFonts w:ascii="Cambria" w:hAnsi="Cambria" w:cs="Arial"/>
+                <w:sz w:val="24"/>
+                <w:szCs w:val="24"/>
+              </w:rPr>
+            </w:pPr>
+            <w:r>
+              <w:rPr>
+                <w:rFonts w:ascii="Cambria" w:hAnsi="Cambria" w:cs="Arial"/>
+                <w:sz w:val="24"/>
+                <w:szCs w:val="24"/>
+              </w:rPr>
+              <w:t xml:space="preserve">Entre todos hablamos sobre el trabajo que se asignó de manera individual para la entrega, poniendo al tanto a todos </w:t>
+            </w:r>
+          </w:p>
+        </w:tc>
+        <w:tc>
+          <w:tcPr>
+            <w:tcW w:w="1287" w:type="dxa"/>
+          </w:tcPr>
+          <w:p>
+            <w:pPr>
+              <w:jc w:val="center"/>
+              <w:rPr>
+                <w:rFonts w:ascii="Cambria" w:hAnsi="Cambria" w:cs="Arial"/>
+                <w:sz w:val="24"/>
+                <w:szCs w:val="24"/>
+              </w:rPr>
+            </w:pPr>
+            <w:r>
+              <w:rPr>
+                <w:rFonts w:ascii="Cambria" w:hAnsi="Cambria" w:cs="Arial"/>
+                <w:sz w:val="24"/>
+                <w:szCs w:val="24"/>
+              </w:rPr>
+              <w:t>Se logró el primer avance del proyecto</w:t>
+            </w:r>
+          </w:p>
+        </w:tc>
+        <w:tc>
+          <w:tcPr>
+            <w:tcW w:w="1546" w:type="dxa"/>
+          </w:tcPr>
+          <w:p>
+            <w:pPr>
+              <w:jc w:val="center"/>
+              <w:rPr>
+                <w:rFonts w:ascii="Cambria" w:hAnsi="Cambria" w:cs="Arial"/>
+                <w:sz w:val="24"/>
+                <w:szCs w:val="24"/>
+              </w:rPr>
+            </w:pPr>
+            <w:r>
+              <w:rPr>
+                <w:rFonts w:ascii="Cambria" w:hAnsi="Cambria" w:cs="Arial"/>
+                <w:sz w:val="24"/>
+                <w:szCs w:val="24"/>
+              </w:rPr>
+              <w:t>Problemas menores con la comunicación general</w:t>
+            </w:r>
+          </w:p>
+        </w:tc>
+        <w:tc>
+          <w:tcPr>
+            <w:tcW w:w="1274" w:type="dxa"/>
+          </w:tcPr>
+          <w:p>
+            <w:pPr>
+              <w:jc w:val="center"/>
+              <w:rPr>
+                <w:rFonts w:ascii="Cambria" w:hAnsi="Cambria" w:cs="Arial"/>
+                <w:sz w:val="24"/>
+                <w:szCs w:val="24"/>
+              </w:rPr>
+            </w:pPr>
+            <w:r>
+              <w:rPr>
+                <w:rFonts w:ascii="Cambria" w:hAnsi="Cambria" w:cs="Arial"/>
+                <w:sz w:val="24"/>
+                <w:szCs w:val="24"/>
+              </w:rPr>
+              <w:t>Logramos todos entender y tener claro el rumbo del proyecto al futuro</w:t>
+            </w:r>
+          </w:p>
+        </w:tc>
+        <w:tc>
+          <w:tcPr>
+            <w:tcW w:w="1437" w:type="dxa"/>
+          </w:tcPr>
+          <w:p>
+            <w:pPr>
+              <w:jc w:val="center"/>
+              <w:rPr>
+                <w:rFonts w:ascii="Cambria" w:hAnsi="Cambria" w:cs="Arial"/>
+                <w:sz w:val="24"/>
+                <w:szCs w:val="24"/>
+              </w:rPr>
+            </w:pPr>
+            <w:r>
+              <w:rPr>
+                <w:rFonts w:ascii="Cambria" w:hAnsi="Cambria" w:cs="Arial"/>
+                <w:sz w:val="24"/>
+                <w:szCs w:val="24"/>
+              </w:rPr>
+              <w:t>Excelente/ Adecuada/ I</w:t>
+            </w:r>
+            <w:r>
+              <w:rPr>
+                <w:rFonts w:ascii="Cambria" w:hAnsi="Cambria" w:cs="Arial"/>
+                <w:sz w:val="24"/>
+                <w:szCs w:val="24"/>
+              </w:rPr>
+              <w:t>nsuficiente</w:t>
+            </w:r>
+          </w:p>
+          <w:p>
+            <w:pPr>
+              <w:jc w:val="center"/>
+              <w:rPr>
+                <w:rFonts w:ascii="Cambria" w:hAnsi="Cambria" w:cs="Arial"/>
+                <w:sz w:val="24"/>
+                <w:szCs w:val="24"/>
+              </w:rPr>
+            </w:pPr>
+          </w:p>
+          <w:p>
+            <w:pPr>
+              <w:jc w:val="center"/>
+              <w:rPr>
+                <w:rFonts w:ascii="Cambria" w:hAnsi="Cambria" w:cs="Arial"/>
+                <w:sz w:val="24"/>
+                <w:szCs w:val="24"/>
+              </w:rPr>
+            </w:pPr>
+            <w:r>
+              <w:rPr>
+                <w:rFonts w:ascii="Cambria" w:hAnsi="Cambria" w:cs="Arial"/>
+                <w:sz w:val="24"/>
+                <w:szCs w:val="24"/>
+              </w:rPr>
+              <w:t>El desempeño general del equipo se califica en excelente</w:t>
+            </w:r>
+          </w:p>
+        </w:tc>
+      </w:tr>
+      <w:tr>
+        <w:trPr>
+          <w:trHeight w:val="3676"/>
+        </w:trPr>
+        <w:tc>
+          <w:tcPr>
+            <w:tcW w:w="897" w:type="dxa"/>
+          </w:tcPr>
+          <w:p>
+            <w:pPr>
+              <w:jc w:val="center"/>
+              <w:rPr>
+                <w:rFonts w:ascii="Cambria" w:hAnsi="Cambria" w:cs="Arial"/>
+                <w:sz w:val="24"/>
+                <w:szCs w:val="24"/>
+              </w:rPr>
+            </w:pPr>
+            <w:r>
+              <w:rPr>
+                <w:rFonts w:ascii="Cambria" w:hAnsi="Cambria" w:cs="Arial"/>
+                <w:sz w:val="24"/>
+                <w:szCs w:val="24"/>
+              </w:rPr>
+              <w:t>19-5</w:t>
+            </w:r>
+          </w:p>
+        </w:tc>
+        <w:tc>
+          <w:tcPr>
+            <w:tcW w:w="1653" w:type="dxa"/>
+          </w:tcPr>
+          <w:p>
+            <w:pPr>
+              <w:jc w:val="center"/>
+              <w:rPr>
+                <w:rFonts w:ascii="Cambria" w:hAnsi="Cambria" w:cs="Arial"/>
+                <w:sz w:val="24"/>
+                <w:szCs w:val="24"/>
+              </w:rPr>
+            </w:pPr>
+            <w:r>
+              <w:rPr>
+                <w:rFonts w:ascii="Cambria" w:hAnsi="Cambria" w:cs="Arial"/>
+                <w:sz w:val="24"/>
+                <w:szCs w:val="24"/>
+              </w:rPr>
+              <w:t>Allan</w:t>
+            </w:r>
+          </w:p>
+          <w:p>
+            <w:pPr>
+              <w:jc w:val="center"/>
+              <w:rPr>
+                <w:rFonts w:ascii="Cambria" w:hAnsi="Cambria" w:cs="Arial"/>
+                <w:sz w:val="24"/>
+                <w:szCs w:val="24"/>
+              </w:rPr>
+            </w:pPr>
+            <w:r>
+              <w:rPr>
+                <w:rFonts w:ascii="Cambria" w:hAnsi="Cambria" w:cs="Arial"/>
+                <w:sz w:val="24"/>
+                <w:szCs w:val="24"/>
+              </w:rPr>
+              <w:t>Carlos</w:t>
+            </w:r>
+          </w:p>
+          <w:p>
+            <w:pPr>
+              <w:jc w:val="center"/>
+              <w:rPr>
+                <w:rFonts w:ascii="Cambria" w:hAnsi="Cambria" w:cs="Arial"/>
+                <w:sz w:val="24"/>
+                <w:szCs w:val="24"/>
+              </w:rPr>
+            </w:pPr>
+            <w:r>
+              <w:rPr>
+                <w:rFonts w:ascii="Cambria" w:hAnsi="Cambria" w:cs="Arial"/>
+                <w:sz w:val="24"/>
+                <w:szCs w:val="24"/>
+              </w:rPr>
+              <w:t>Josimar</w:t>
+            </w:r>
+          </w:p>
+          <w:p>
+            <w:pPr>
+              <w:jc w:val="center"/>
+              <w:rPr>
+                <w:rFonts w:ascii="Cambria" w:hAnsi="Cambria" w:cs="Arial"/>
+                <w:sz w:val="24"/>
+                <w:szCs w:val="24"/>
+              </w:rPr>
+            </w:pPr>
+            <w:r>
+              <w:rPr>
+                <w:rFonts w:ascii="Cambria" w:hAnsi="Cambria" w:cs="Arial"/>
+                <w:sz w:val="24"/>
+                <w:szCs w:val="24"/>
+              </w:rPr>
+              <w:t>Jean Marco</w:t>
+            </w:r>
+          </w:p>
+        </w:tc>
+        <w:tc>
+          <w:tcPr>
+            <w:tcW w:w="1389" w:type="dxa"/>
+          </w:tcPr>
+          <w:p>
+            <w:pPr>
+              <w:jc w:val="center"/>
+              <w:rPr>
+                <w:rFonts w:ascii="Cambria" w:hAnsi="Cambria" w:cs="Arial"/>
+                <w:sz w:val="24"/>
+                <w:szCs w:val="24"/>
+              </w:rPr>
+            </w:pPr>
+            <w:r>
+              <w:rPr>
+                <w:rFonts w:ascii="Cambria" w:hAnsi="Cambria" w:cs="Arial"/>
+                <w:sz w:val="24"/>
+                <w:szCs w:val="24"/>
+              </w:rPr>
+              <w:t>Iniciar con el proyecto en IntelliJ</w:t>
+            </w:r>
+          </w:p>
+        </w:tc>
+        <w:tc>
+          <w:tcPr>
+            <w:tcW w:w="1552" w:type="dxa"/>
+          </w:tcPr>
+          <w:p>
+            <w:pPr>
+              <w:jc w:val="center"/>
+              <w:rPr>
+                <w:rFonts w:ascii="Cambria" w:hAnsi="Cambria" w:cs="Arial"/>
+                <w:sz w:val="24"/>
+                <w:szCs w:val="24"/>
+              </w:rPr>
+            </w:pPr>
+            <w:r>
+              <w:rPr>
+                <w:rFonts w:ascii="Cambria" w:hAnsi="Cambria" w:cs="Arial"/>
+                <w:sz w:val="24"/>
+                <w:szCs w:val="24"/>
+              </w:rPr>
+              <w:t>Entre el grupo se trabaja en la creación del proyecto con sus componentes, Jean Marco fue el encargado de crear el documento y subirlo</w:t>
+            </w:r>
+          </w:p>
+        </w:tc>
+        <w:tc>
+          <w:tcPr>
+            <w:tcW w:w="1287" w:type="dxa"/>
+          </w:tcPr>
+          <w:p>
+            <w:pPr>
+              <w:jc w:val="center"/>
+              <w:rPr>
+                <w:rFonts w:ascii="Cambria" w:hAnsi="Cambria" w:cs="Arial"/>
+                <w:sz w:val="24"/>
+                <w:szCs w:val="24"/>
+              </w:rPr>
+            </w:pPr>
+          </w:p>
+        </w:tc>
+        <w:tc>
+          <w:tcPr>
+            <w:tcW w:w="1546" w:type="dxa"/>
+          </w:tcPr>
+          <w:p>
+            <w:pPr>
+              <w:jc w:val="center"/>
+              <w:rPr>
+                <w:rFonts w:ascii="Cambria" w:hAnsi="Cambria" w:cs="Arial"/>
+                <w:sz w:val="24"/>
+                <w:szCs w:val="24"/>
+              </w:rPr>
+            </w:pPr>
+            <w:r>
+              <w:rPr>
+                <w:rFonts w:ascii="Cambria" w:hAnsi="Cambria" w:cs="Arial"/>
+                <w:sz w:val="24"/>
+                <w:szCs w:val="24"/>
+              </w:rPr>
+              <w:t>Falta de un integrante</w:t>
+            </w:r>
+          </w:p>
+        </w:tc>
+        <w:tc>
+          <w:tcPr>
+            <w:tcW w:w="1274" w:type="dxa"/>
+          </w:tcPr>
+          <w:p>
+            <w:pPr>
+              <w:jc w:val="center"/>
+              <w:rPr>
+                <w:rFonts w:ascii="Cambria" w:hAnsi="Cambria" w:cs="Arial"/>
+                <w:sz w:val="24"/>
+                <w:szCs w:val="24"/>
+              </w:rPr>
+            </w:pPr>
+          </w:p>
+        </w:tc>
+        <w:tc>
+          <w:tcPr>
+            <w:tcW w:w="1437" w:type="dxa"/>
+          </w:tcPr>
+          <w:p>
+            <w:pPr>
+              <w:jc w:val="center"/>
+              <w:rPr>
+                <w:rFonts w:ascii="Cambria" w:hAnsi="Cambria" w:cs="Arial"/>
+                <w:sz w:val="24"/>
+                <w:szCs w:val="24"/>
+              </w:rPr>
+            </w:pPr>
+            <w:r>
+              <w:rPr>
+                <w:rFonts w:ascii="Cambria" w:hAnsi="Cambria" w:cs="Arial"/>
+                <w:sz w:val="24"/>
+                <w:szCs w:val="24"/>
+              </w:rPr>
+              <w:t>El aporte de Jean fue excelente, el resto se califica como adecuado y Melvin queda en insuficiente, no se presentó</w:t>
+            </w:r>
+          </w:p>
+        </w:tc>
+      </w:tr>
+      <w:tr>
+        <w:trPr>
+          <w:trHeight w:val="3676"/>
+        </w:trPr>
+        <w:tc>
+          <w:tcPr>
+            <w:tcW w:w="897" w:type="dxa"/>
+          </w:tcPr>
+          <w:p>
+            <w:pPr>
+              <w:jc w:val="center"/>
+              <w:rPr>
+                <w:rFonts w:ascii="Cambria" w:hAnsi="Cambria" w:cs="Arial"/>
+                <w:sz w:val="24"/>
+                <w:szCs w:val="24"/>
+              </w:rPr>
+            </w:pPr>
+            <w:r>
+              <w:rPr>
+                <w:rFonts w:ascii="Cambria" w:hAnsi="Cambria" w:cs="Arial"/>
+                <w:sz w:val="24"/>
+                <w:szCs w:val="24"/>
+              </w:rPr>
+              <w:lastRenderedPageBreak/>
+              <w:t>25-5</w:t>
+            </w:r>
+          </w:p>
+        </w:tc>
+        <w:tc>
+          <w:tcPr>
+            <w:tcW w:w="1653" w:type="dxa"/>
+          </w:tcPr>
+          <w:p>
+            <w:pPr>
+              <w:jc w:val="center"/>
+              <w:rPr>
+                <w:rFonts w:ascii="Cambria" w:hAnsi="Cambria" w:cs="Arial"/>
+                <w:sz w:val="24"/>
+                <w:szCs w:val="24"/>
+              </w:rPr>
+            </w:pPr>
+            <w:r>
+              <w:rPr>
+                <w:rFonts w:ascii="Cambria" w:hAnsi="Cambria" w:cs="Arial"/>
+                <w:sz w:val="24"/>
+                <w:szCs w:val="24"/>
+              </w:rPr>
+              <w:t>Josimar</w:t>
+            </w:r>
+          </w:p>
+          <w:p>
+            <w:pPr>
+              <w:jc w:val="center"/>
+              <w:rPr>
+                <w:rFonts w:ascii="Cambria" w:hAnsi="Cambria" w:cs="Arial"/>
+                <w:sz w:val="24"/>
+                <w:szCs w:val="24"/>
+              </w:rPr>
+            </w:pPr>
+            <w:r>
+              <w:rPr>
+                <w:rFonts w:ascii="Cambria" w:hAnsi="Cambria" w:cs="Arial"/>
+                <w:sz w:val="24"/>
+                <w:szCs w:val="24"/>
+              </w:rPr>
+              <w:t>Carlos</w:t>
+            </w:r>
+          </w:p>
+          <w:p>
+            <w:pPr>
+              <w:jc w:val="center"/>
+              <w:rPr>
+                <w:rFonts w:ascii="Cambria" w:hAnsi="Cambria" w:cs="Arial"/>
+                <w:sz w:val="24"/>
+                <w:szCs w:val="24"/>
+              </w:rPr>
+            </w:pPr>
+            <w:r>
+              <w:rPr>
+                <w:rFonts w:ascii="Cambria" w:hAnsi="Cambria" w:cs="Arial"/>
+                <w:sz w:val="24"/>
+                <w:szCs w:val="24"/>
+              </w:rPr>
+              <w:t xml:space="preserve">Allan </w:t>
+            </w:r>
+          </w:p>
+          <w:p>
+            <w:pPr>
+              <w:jc w:val="center"/>
+              <w:rPr>
+                <w:rFonts w:ascii="Cambria" w:hAnsi="Cambria" w:cs="Arial"/>
+                <w:sz w:val="24"/>
+                <w:szCs w:val="24"/>
+              </w:rPr>
+            </w:pPr>
+            <w:r>
+              <w:rPr>
+                <w:rFonts w:ascii="Cambria" w:hAnsi="Cambria" w:cs="Arial"/>
+                <w:sz w:val="24"/>
+                <w:szCs w:val="24"/>
+              </w:rPr>
+              <w:t>Melvin</w:t>
+            </w:r>
+          </w:p>
+          <w:p>
+            <w:pPr>
+              <w:jc w:val="center"/>
+              <w:rPr>
+                <w:rFonts w:ascii="Cambria" w:hAnsi="Cambria" w:cs="Arial"/>
+                <w:sz w:val="24"/>
+                <w:szCs w:val="24"/>
+              </w:rPr>
+            </w:pPr>
+            <w:r>
+              <w:rPr>
+                <w:rFonts w:ascii="Cambria" w:hAnsi="Cambria" w:cs="Arial"/>
+                <w:sz w:val="24"/>
+                <w:szCs w:val="24"/>
+              </w:rPr>
+              <w:t>Jean Marco</w:t>
+            </w:r>
+          </w:p>
+        </w:tc>
+        <w:tc>
+          <w:tcPr>
+            <w:tcW w:w="1389" w:type="dxa"/>
+          </w:tcPr>
+          <w:p>
+            <w:pPr>
+              <w:jc w:val="center"/>
+              <w:rPr>
+                <w:rFonts w:ascii="Cambria" w:hAnsi="Cambria" w:cs="Arial"/>
+                <w:sz w:val="24"/>
+                <w:szCs w:val="24"/>
+              </w:rPr>
+            </w:pPr>
+            <w:r>
+              <w:rPr>
+                <w:rFonts w:ascii="Cambria" w:hAnsi="Cambria" w:cs="Arial"/>
+                <w:sz w:val="24"/>
+                <w:szCs w:val="24"/>
+              </w:rPr>
+              <w:t>Crear las bases del Backend de los 3 módulos del proyecto</w:t>
+            </w:r>
+          </w:p>
+        </w:tc>
+        <w:tc>
+          <w:tcPr>
+            <w:tcW w:w="1552" w:type="dxa"/>
+          </w:tcPr>
+          <w:p>
+            <w:pPr>
+              <w:jc w:val="center"/>
+              <w:rPr>
+                <w:rFonts w:ascii="Cambria" w:hAnsi="Cambria" w:cs="Arial"/>
+                <w:sz w:val="24"/>
+                <w:szCs w:val="24"/>
+              </w:rPr>
+            </w:pPr>
+            <w:r>
+              <w:rPr>
+                <w:rFonts w:ascii="Cambria" w:hAnsi="Cambria" w:cs="Arial"/>
+                <w:sz w:val="24"/>
+                <w:szCs w:val="24"/>
+              </w:rPr>
+              <w:t>Jean Marco debido a compromisos deportivos se encargó de supervisar que los compañeros hicieran el trabajo correctamente. Jossimar, Carlos y Melvin escribieron el backend de cada módulo, Allan supervisó todo generalmente y ayudó en explicación de código. Carlos asesoró con el GitHub</w:t>
+            </w:r>
+          </w:p>
+        </w:tc>
+        <w:tc>
+          <w:tcPr>
+            <w:tcW w:w="1287" w:type="dxa"/>
+          </w:tcPr>
+          <w:p>
+            <w:pPr>
+              <w:jc w:val="center"/>
+              <w:rPr>
+                <w:rFonts w:ascii="Cambria" w:hAnsi="Cambria" w:cs="Arial"/>
+                <w:sz w:val="24"/>
+                <w:szCs w:val="24"/>
+              </w:rPr>
+            </w:pPr>
+            <w:r>
+              <w:rPr>
+                <w:rFonts w:ascii="Cambria" w:hAnsi="Cambria" w:cs="Arial"/>
+                <w:sz w:val="24"/>
+                <w:szCs w:val="24"/>
+              </w:rPr>
+              <w:t xml:space="preserve">Se logró el objetivo, avanzar con los métodos del buscar todo, buscar por nombre y añadir, en los 3 </w:t>
+            </w:r>
+            <w:proofErr w:type="spellStart"/>
+            <w:r>
+              <w:rPr>
+                <w:rFonts w:ascii="Cambria" w:hAnsi="Cambria" w:cs="Arial"/>
+                <w:sz w:val="24"/>
+                <w:szCs w:val="24"/>
+              </w:rPr>
+              <w:t>metodos</w:t>
+            </w:r>
+            <w:proofErr w:type="spellEnd"/>
+          </w:p>
+        </w:tc>
+        <w:tc>
+          <w:tcPr>
+            <w:tcW w:w="1546" w:type="dxa"/>
+          </w:tcPr>
+          <w:p>
+            <w:pPr>
+              <w:jc w:val="center"/>
+              <w:rPr>
+                <w:rFonts w:ascii="Cambria" w:hAnsi="Cambria" w:cs="Arial"/>
+                <w:sz w:val="24"/>
+                <w:szCs w:val="24"/>
+              </w:rPr>
+            </w:pPr>
+            <w:r>
+              <w:rPr>
+                <w:rFonts w:ascii="Cambria" w:hAnsi="Cambria" w:cs="Arial"/>
+                <w:sz w:val="24"/>
+                <w:szCs w:val="24"/>
+              </w:rPr>
+              <w:t>Un integrante tuvo que irse temprano y otro se conectó tarde</w:t>
+            </w:r>
+          </w:p>
+        </w:tc>
+        <w:tc>
+          <w:tcPr>
+            <w:tcW w:w="1274" w:type="dxa"/>
+          </w:tcPr>
+          <w:p>
+            <w:pPr>
+              <w:jc w:val="center"/>
+              <w:rPr>
+                <w:rFonts w:ascii="Cambria" w:hAnsi="Cambria" w:cs="Arial"/>
+                <w:sz w:val="24"/>
+                <w:szCs w:val="24"/>
+              </w:rPr>
+            </w:pPr>
+            <w:r>
+              <w:rPr>
+                <w:rFonts w:ascii="Cambria" w:hAnsi="Cambria" w:cs="Arial"/>
+                <w:sz w:val="24"/>
+                <w:szCs w:val="24"/>
+              </w:rPr>
+              <w:t>El repositorio se logró modificar y quedó excelente</w:t>
+            </w:r>
+          </w:p>
+        </w:tc>
+        <w:tc>
+          <w:tcPr>
+            <w:tcW w:w="1437" w:type="dxa"/>
+          </w:tcPr>
+          <w:p>
+            <w:pPr>
+              <w:jc w:val="center"/>
+              <w:rPr>
+                <w:rFonts w:ascii="Cambria" w:hAnsi="Cambria" w:cs="Arial"/>
+                <w:sz w:val="24"/>
+                <w:szCs w:val="24"/>
+              </w:rPr>
+            </w:pPr>
+            <w:r>
+              <w:rPr>
+                <w:rFonts w:ascii="Cambria" w:hAnsi="Cambria" w:cs="Arial"/>
+                <w:sz w:val="24"/>
+                <w:szCs w:val="24"/>
+              </w:rPr>
+              <w:t xml:space="preserve">El aporte de Jean Marco fue adecuado, el resto </w:t>
+            </w:r>
+            <w:proofErr w:type="gramStart"/>
+            <w:r>
+              <w:rPr>
+                <w:rFonts w:ascii="Cambria" w:hAnsi="Cambria" w:cs="Arial"/>
+                <w:sz w:val="24"/>
+                <w:szCs w:val="24"/>
+              </w:rPr>
+              <w:t>lo  hicieron</w:t>
+            </w:r>
+            <w:proofErr w:type="gramEnd"/>
+            <w:r>
+              <w:rPr>
+                <w:rFonts w:ascii="Cambria" w:hAnsi="Cambria" w:cs="Arial"/>
+                <w:sz w:val="24"/>
+                <w:szCs w:val="24"/>
+              </w:rPr>
+              <w:t xml:space="preserve"> en excelente</w:t>
+            </w:r>
+          </w:p>
+        </w:tc>
+      </w:tr>
+    </w:tbl>
     <w:p/>
     <w:p>
-      <w:r>
-        <w:t xml:space="preserve">13-5-2026 </w:t>
-      </w:r>
-      <w:r>
-        <w:br/>
-        <w:t xml:space="preserve">-Iniciamos creando el repositorio con las ramas, vinculándolo a las cuentas de todos </w:t>
-      </w:r>
-      <w:proofErr w:type="spellStart"/>
-      <w:r>
-        <w:t>uds</w:t>
-      </w:r>
-      <w:proofErr w:type="spellEnd"/>
       <w:r>
         <w:br/>
       </w:r>
@@ -28,7 +1380,7 @@
     <w:p/>
     <w:sectPr>
       <w:pgSz w:w="12240" w:h="15840"/>
-      <w:pgMar w:top="1417" w:right="1701" w:bottom="1417" w:left="1701" w:header="708" w:footer="708" w:gutter="0"/>
+      <w:pgMar w:top="720" w:right="474" w:bottom="720" w:left="720" w:header="708" w:footer="708" w:gutter="0"/>
       <w:cols w:space="708"/>
       <w:docGrid w:linePitch="360"/>
     </w:sectPr>
@@ -434,6 +1786,7 @@
   <w:style w:type="paragraph" w:default="1" w:styleId="Normal">
     <w:name w:val="Normal"/>
     <w:qFormat/>
+    <w:rsid w:val="003814A7"/>
   </w:style>
   <w:style w:type="character" w:default="1" w:styleId="Fuentedeprrafopredeter">
     <w:name w:val="Default Paragraph Font"/>
@@ -461,6 +1814,25 @@
     <w:uiPriority w:val="99"/>
     <w:semiHidden/>
     <w:unhideWhenUsed/>
+  </w:style>
+  <w:style w:type="table" w:styleId="Tablaconcuadrcula">
+    <w:name w:val="Table Grid"/>
+    <w:basedOn w:val="Tablanormal"/>
+    <w:uiPriority w:val="39"/>
+    <w:rsid w:val="007D2B85"/>
+    <w:pPr>
+      <w:spacing w:after="0" w:line="240" w:lineRule="auto"/>
+    </w:pPr>
+    <w:tblPr>
+      <w:tblBorders>
+        <w:top w:val="single" w:sz="4" w:space="0" w:color="auto"/>
+        <w:left w:val="single" w:sz="4" w:space="0" w:color="auto"/>
+        <w:bottom w:val="single" w:sz="4" w:space="0" w:color="auto"/>
+        <w:right w:val="single" w:sz="4" w:space="0" w:color="auto"/>
+        <w:insideH w:val="single" w:sz="4" w:space="0" w:color="auto"/>
+        <w:insideV w:val="single" w:sz="4" w:space="0" w:color="auto"/>
+      </w:tblBorders>
+    </w:tblPr>
   </w:style>
 </w:styles>
 </file>

</xml_diff>

<commit_message>
actualizacion de la bitacora
</commit_message>
<xml_diff>
--- a/Bitácora de trabajo.docx
+++ b/Bitácora de trabajo.docx
@@ -1268,18 +1268,8 @@
                 <w:sz w:val="24"/>
                 <w:szCs w:val="24"/>
               </w:rPr>
-              <w:t xml:space="preserve">Se logró el objetivo, avanzar con los métodos del buscar todo, buscar por nombre y añadir, en los 3 </w:t>
-            </w:r>
-            <w:proofErr w:type="spellStart"/>
-            <w:r>
-              <w:rPr>
-                <w:rFonts w:ascii="Cambria" w:hAnsi="Cambria" w:cs="Arial"/>
-                <w:sz w:val="24"/>
-                <w:szCs w:val="24"/>
-              </w:rPr>
-              <w:t>metodos</w:t>
-            </w:r>
-            <w:proofErr w:type="spellEnd"/>
+              <w:t>Se logró el objetivo, avanzar con los métodos del buscar todo, buscar por nombre y añadir, en los 3 metodos</w:t>
+            </w:r>
           </w:p>
         </w:tc>
         <w:tc>
@@ -1347,25 +1337,7 @@
                 <w:sz w:val="24"/>
                 <w:szCs w:val="24"/>
               </w:rPr>
-              <w:t xml:space="preserve">El aporte de Jean Marco fue adecuado, el resto </w:t>
-            </w:r>
-            <w:proofErr w:type="gramStart"/>
-            <w:r>
-              <w:rPr>
-                <w:rFonts w:ascii="Cambria" w:hAnsi="Cambria" w:cs="Arial"/>
-                <w:sz w:val="24"/>
-                <w:szCs w:val="24"/>
-              </w:rPr>
-              <w:t>lo  hicieron</w:t>
-            </w:r>
-            <w:proofErr w:type="gramEnd"/>
-            <w:r>
-              <w:rPr>
-                <w:rFonts w:ascii="Cambria" w:hAnsi="Cambria" w:cs="Arial"/>
-                <w:sz w:val="24"/>
-                <w:szCs w:val="24"/>
-              </w:rPr>
-              <w:t xml:space="preserve"> en excelente</w:t>
+              <w:t>El aporte de Jean Marco fue adecuado, el resto lo  hicieron en excelente</w:t>
             </w:r>
           </w:p>
         </w:tc>
@@ -1512,25 +1484,7 @@
                 <w:sz w:val="24"/>
                 <w:szCs w:val="24"/>
               </w:rPr>
-              <w:t xml:space="preserve">Modificar </w:t>
-            </w:r>
-            <w:proofErr w:type="spellStart"/>
-            <w:r>
-              <w:rPr>
-                <w:rFonts w:ascii="Cambria" w:hAnsi="Cambria" w:cs="Arial"/>
-                <w:sz w:val="24"/>
-                <w:szCs w:val="24"/>
-              </w:rPr>
-              <w:t>backend</w:t>
-            </w:r>
-            <w:proofErr w:type="spellEnd"/>
-            <w:r>
-              <w:rPr>
-                <w:rFonts w:ascii="Cambria" w:hAnsi="Cambria" w:cs="Arial"/>
-                <w:sz w:val="24"/>
-                <w:szCs w:val="24"/>
-              </w:rPr>
-              <w:t xml:space="preserve"> y añadir funciones</w:t>
+              <w:t>Modificar backend y añadir funciones</w:t>
             </w:r>
           </w:p>
         </w:tc>
@@ -1576,54 +1530,8 @@
                 <w:sz w:val="24"/>
                 <w:szCs w:val="24"/>
               </w:rPr>
-              <w:t xml:space="preserve">Se cambiaron nombres de variables y se configuró la base de datos en el </w:t>
-            </w:r>
-            <w:proofErr w:type="spellStart"/>
-            <w:r>
-              <w:rPr>
-                <w:rFonts w:ascii="Cambria" w:hAnsi="Cambria" w:cs="Arial"/>
-                <w:sz w:val="24"/>
-                <w:szCs w:val="24"/>
-              </w:rPr>
-              <w:t>application</w:t>
-            </w:r>
-            <w:proofErr w:type="spellEnd"/>
-            <w:r>
-              <w:rPr>
-                <w:rFonts w:ascii="Cambria" w:hAnsi="Cambria" w:cs="Arial"/>
-                <w:sz w:val="24"/>
-                <w:szCs w:val="24"/>
-              </w:rPr>
-              <w:t xml:space="preserve"> </w:t>
-            </w:r>
-            <w:proofErr w:type="spellStart"/>
-            <w:r>
-              <w:rPr>
-                <w:rFonts w:ascii="Cambria" w:hAnsi="Cambria" w:cs="Arial"/>
-                <w:sz w:val="24"/>
-                <w:szCs w:val="24"/>
-              </w:rPr>
-              <w:t>propierties</w:t>
-            </w:r>
-            <w:proofErr w:type="spellEnd"/>
-            <w:r>
-              <w:rPr>
-                <w:rFonts w:ascii="Cambria" w:hAnsi="Cambria" w:cs="Arial"/>
-                <w:sz w:val="24"/>
-                <w:szCs w:val="24"/>
-              </w:rPr>
-              <w:t xml:space="preserve"> y en el </w:t>
-            </w:r>
-            <w:proofErr w:type="spellStart"/>
-            <w:r>
-              <w:rPr>
-                <w:rFonts w:ascii="Cambria" w:hAnsi="Cambria" w:cs="Arial"/>
-                <w:sz w:val="24"/>
-                <w:szCs w:val="24"/>
-              </w:rPr>
-              <w:t>pom</w:t>
-            </w:r>
-            <w:proofErr w:type="spellEnd"/>
+              <w:t>Se cambiaron nombres de variables y se configuró la base de datos en el application propierties y en el pom</w:t>
+            </w:r>
           </w:p>
         </w:tc>
         <w:tc>
@@ -1748,6 +1656,323 @@
                 <w:szCs w:val="24"/>
               </w:rPr>
               <w:t>Melvin insuficiente</w:t>
+            </w:r>
+          </w:p>
+        </w:tc>
+      </w:tr>
+      <w:tr>
+        <w:trPr>
+          <w:trHeight w:val="3676"/>
+        </w:trPr>
+        <w:tc>
+          <w:tcPr>
+            <w:tcW w:w="897" w:type="dxa"/>
+          </w:tcPr>
+          <w:p>
+            <w:pPr>
+              <w:jc w:val="center"/>
+              <w:rPr>
+                <w:rFonts w:ascii="Cambria" w:hAnsi="Cambria" w:cs="Arial"/>
+                <w:sz w:val="24"/>
+                <w:szCs w:val="24"/>
+              </w:rPr>
+            </w:pPr>
+            <w:r>
+              <w:rPr>
+                <w:rFonts w:ascii="Cambria" w:hAnsi="Cambria" w:cs="Arial"/>
+                <w:sz w:val="24"/>
+                <w:szCs w:val="24"/>
+              </w:rPr>
+              <w:t>18-6</w:t>
+            </w:r>
+          </w:p>
+        </w:tc>
+        <w:tc>
+          <w:tcPr>
+            <w:tcW w:w="1653" w:type="dxa"/>
+          </w:tcPr>
+          <w:p>
+            <w:pPr>
+              <w:jc w:val="center"/>
+              <w:rPr>
+                <w:rFonts w:ascii="Cambria" w:hAnsi="Cambria" w:cs="Arial"/>
+                <w:sz w:val="24"/>
+                <w:szCs w:val="24"/>
+              </w:rPr>
+            </w:pPr>
+            <w:r>
+              <w:rPr>
+                <w:rFonts w:ascii="Cambria" w:hAnsi="Cambria" w:cs="Arial"/>
+                <w:sz w:val="24"/>
+                <w:szCs w:val="24"/>
+              </w:rPr>
+              <w:t>Josimar</w:t>
+            </w:r>
+          </w:p>
+          <w:p>
+            <w:pPr>
+              <w:jc w:val="center"/>
+              <w:rPr>
+                <w:rFonts w:ascii="Cambria" w:hAnsi="Cambria" w:cs="Arial"/>
+                <w:sz w:val="24"/>
+                <w:szCs w:val="24"/>
+              </w:rPr>
+            </w:pPr>
+            <w:r>
+              <w:rPr>
+                <w:rFonts w:ascii="Cambria" w:hAnsi="Cambria" w:cs="Arial"/>
+                <w:sz w:val="24"/>
+                <w:szCs w:val="24"/>
+              </w:rPr>
+              <w:t>Carlos</w:t>
+            </w:r>
+          </w:p>
+          <w:p>
+            <w:pPr>
+              <w:jc w:val="center"/>
+              <w:rPr>
+                <w:rFonts w:ascii="Cambria" w:hAnsi="Cambria" w:cs="Arial"/>
+                <w:sz w:val="24"/>
+                <w:szCs w:val="24"/>
+              </w:rPr>
+            </w:pPr>
+            <w:r>
+              <w:rPr>
+                <w:rFonts w:ascii="Cambria" w:hAnsi="Cambria" w:cs="Arial"/>
+                <w:sz w:val="24"/>
+                <w:szCs w:val="24"/>
+              </w:rPr>
+              <w:t xml:space="preserve">Allan </w:t>
+            </w:r>
+          </w:p>
+          <w:p>
+            <w:pPr>
+              <w:jc w:val="center"/>
+              <w:rPr>
+                <w:rFonts w:ascii="Cambria" w:hAnsi="Cambria" w:cs="Arial"/>
+                <w:sz w:val="24"/>
+                <w:szCs w:val="24"/>
+              </w:rPr>
+            </w:pPr>
+            <w:r>
+              <w:rPr>
+                <w:rFonts w:ascii="Cambria" w:hAnsi="Cambria" w:cs="Arial"/>
+                <w:sz w:val="24"/>
+                <w:szCs w:val="24"/>
+              </w:rPr>
+              <w:t>Melvin</w:t>
+            </w:r>
+          </w:p>
+          <w:p>
+            <w:pPr>
+              <w:jc w:val="center"/>
+              <w:rPr>
+                <w:rFonts w:ascii="Cambria" w:hAnsi="Cambria" w:cs="Arial"/>
+                <w:sz w:val="24"/>
+                <w:szCs w:val="24"/>
+              </w:rPr>
+            </w:pPr>
+            <w:r>
+              <w:rPr>
+                <w:rFonts w:ascii="Cambria" w:hAnsi="Cambria" w:cs="Arial"/>
+                <w:sz w:val="24"/>
+                <w:szCs w:val="24"/>
+              </w:rPr>
+              <w:t>Jean Marco</w:t>
+            </w:r>
+          </w:p>
+        </w:tc>
+        <w:tc>
+          <w:tcPr>
+            <w:tcW w:w="1389" w:type="dxa"/>
+          </w:tcPr>
+          <w:p>
+            <w:pPr>
+              <w:jc w:val="center"/>
+              <w:rPr>
+                <w:rFonts w:ascii="Cambria" w:hAnsi="Cambria" w:cs="Arial"/>
+                <w:sz w:val="24"/>
+                <w:szCs w:val="24"/>
+              </w:rPr>
+            </w:pPr>
+            <w:r>
+              <w:rPr>
+                <w:rFonts w:ascii="Cambria" w:hAnsi="Cambria" w:cs="Arial"/>
+                <w:sz w:val="24"/>
+                <w:szCs w:val="24"/>
+              </w:rPr>
+              <w:t>Iniciar con el frontend</w:t>
+            </w:r>
+          </w:p>
+        </w:tc>
+        <w:tc>
+          <w:tcPr>
+            <w:tcW w:w="1552" w:type="dxa"/>
+          </w:tcPr>
+          <w:p>
+            <w:pPr>
+              <w:jc w:val="center"/>
+              <w:rPr>
+                <w:rFonts w:ascii="Cambria" w:hAnsi="Cambria" w:cs="Arial"/>
+                <w:sz w:val="24"/>
+                <w:szCs w:val="24"/>
+              </w:rPr>
+            </w:pPr>
+            <w:r>
+              <w:rPr>
+                <w:rFonts w:ascii="Cambria" w:hAnsi="Cambria" w:cs="Arial"/>
+                <w:sz w:val="24"/>
+                <w:szCs w:val="24"/>
+              </w:rPr>
+              <w:t>Se inició con la lógica y  la creación del frontend por medio del HTML inicial</w:t>
+            </w:r>
+          </w:p>
+        </w:tc>
+        <w:tc>
+          <w:tcPr>
+            <w:tcW w:w="1287" w:type="dxa"/>
+          </w:tcPr>
+          <w:p>
+            <w:pPr>
+              <w:jc w:val="center"/>
+              <w:rPr>
+                <w:rFonts w:ascii="Cambria" w:hAnsi="Cambria" w:cs="Arial"/>
+                <w:sz w:val="24"/>
+                <w:szCs w:val="24"/>
+              </w:rPr>
+            </w:pPr>
+            <w:r>
+              <w:rPr>
+                <w:rFonts w:ascii="Cambria" w:hAnsi="Cambria" w:cs="Arial"/>
+                <w:sz w:val="24"/>
+                <w:szCs w:val="24"/>
+              </w:rPr>
+              <w:t>Se diseña el HTML de la pagina inicial</w:t>
+            </w:r>
+          </w:p>
+        </w:tc>
+        <w:tc>
+          <w:tcPr>
+            <w:tcW w:w="1546" w:type="dxa"/>
+          </w:tcPr>
+          <w:p>
+            <w:pPr>
+              <w:jc w:val="center"/>
+              <w:rPr>
+                <w:rFonts w:ascii="Cambria" w:hAnsi="Cambria" w:cs="Arial"/>
+                <w:sz w:val="24"/>
+                <w:szCs w:val="24"/>
+              </w:rPr>
+            </w:pPr>
+            <w:r>
+              <w:rPr>
+                <w:rFonts w:ascii="Cambria" w:hAnsi="Cambria" w:cs="Arial"/>
+                <w:sz w:val="24"/>
+                <w:szCs w:val="24"/>
+              </w:rPr>
+              <w:t>Falta de practica en el frontend</w:t>
+            </w:r>
+          </w:p>
+        </w:tc>
+        <w:tc>
+          <w:tcPr>
+            <w:tcW w:w="1274" w:type="dxa"/>
+          </w:tcPr>
+          <w:p>
+            <w:pPr>
+              <w:jc w:val="center"/>
+              <w:rPr>
+                <w:rFonts w:ascii="Cambria" w:hAnsi="Cambria" w:cs="Arial"/>
+                <w:sz w:val="24"/>
+                <w:szCs w:val="24"/>
+              </w:rPr>
+            </w:pPr>
+            <w:r>
+              <w:rPr>
+                <w:rFonts w:ascii="Cambria" w:hAnsi="Cambria" w:cs="Arial"/>
+                <w:sz w:val="24"/>
+                <w:szCs w:val="24"/>
+              </w:rPr>
+              <w:t>Se dividió el trabajo para después dedicarse al js y al css</w:t>
+            </w:r>
+          </w:p>
+        </w:tc>
+        <w:tc>
+          <w:tcPr>
+            <w:tcW w:w="1437" w:type="dxa"/>
+          </w:tcPr>
+          <w:p>
+            <w:pPr>
+              <w:jc w:val="center"/>
+              <w:rPr>
+                <w:rFonts w:ascii="Cambria" w:hAnsi="Cambria" w:cs="Arial"/>
+                <w:sz w:val="24"/>
+                <w:szCs w:val="24"/>
+              </w:rPr>
+            </w:pPr>
+            <w:r>
+              <w:rPr>
+                <w:rFonts w:ascii="Cambria" w:hAnsi="Cambria" w:cs="Arial"/>
+                <w:sz w:val="24"/>
+                <w:szCs w:val="24"/>
+              </w:rPr>
+              <w:t>Melvin Carlos y Jean excelente</w:t>
+            </w:r>
+          </w:p>
+          <w:p>
+            <w:pPr>
+              <w:jc w:val="center"/>
+              <w:rPr>
+                <w:rFonts w:ascii="Cambria" w:hAnsi="Cambria" w:cs="Arial"/>
+                <w:sz w:val="24"/>
+                <w:szCs w:val="24"/>
+              </w:rPr>
+            </w:pPr>
+          </w:p>
+          <w:p>
+            <w:pPr>
+              <w:jc w:val="center"/>
+              <w:rPr>
+                <w:rFonts w:ascii="Cambria" w:hAnsi="Cambria" w:cs="Arial"/>
+                <w:sz w:val="24"/>
+                <w:szCs w:val="24"/>
+              </w:rPr>
+            </w:pPr>
+            <w:r>
+              <w:rPr>
+                <w:rFonts w:ascii="Cambria" w:hAnsi="Cambria" w:cs="Arial"/>
+                <w:sz w:val="24"/>
+                <w:szCs w:val="24"/>
+              </w:rPr>
+              <w:t>Allan adecuado</w:t>
+            </w:r>
+          </w:p>
+          <w:p>
+            <w:pPr>
+              <w:jc w:val="center"/>
+              <w:rPr>
+                <w:rFonts w:ascii="Cambria" w:hAnsi="Cambria" w:cs="Arial"/>
+                <w:sz w:val="24"/>
+                <w:szCs w:val="24"/>
+              </w:rPr>
+            </w:pPr>
+          </w:p>
+          <w:p>
+            <w:pPr>
+              <w:jc w:val="center"/>
+              <w:rPr>
+                <w:rFonts w:ascii="Cambria" w:hAnsi="Cambria" w:cs="Arial"/>
+                <w:sz w:val="24"/>
+                <w:szCs w:val="24"/>
+              </w:rPr>
+            </w:pPr>
+            <w:r>
+              <w:rPr>
+                <w:rFonts w:ascii="Cambria" w:hAnsi="Cambria" w:cs="Arial"/>
+                <w:sz w:val="24"/>
+                <w:szCs w:val="24"/>
+              </w:rPr>
+              <w:t>Josimar insuficiente</w:t>
             </w:r>
           </w:p>
         </w:tc>
@@ -2168,7 +2393,7 @@
   <w:style w:type="paragraph" w:default="1" w:styleId="Normal">
     <w:name w:val="Normal"/>
     <w:qFormat/>
-    <w:rsid w:val="003814A7"/>
+    <w:rsid w:val="009A7EEA"/>
   </w:style>
   <w:style w:type="character" w:default="1" w:styleId="Fuentedeprrafopredeter">
     <w:name w:val="Default Paragraph Font"/>

</xml_diff>

<commit_message>
Se actualizó la bitacora y se eliminó un documento perdido
</commit_message>
<xml_diff>
--- a/Bitácora de trabajo.docx
+++ b/Bitácora de trabajo.docx
@@ -61,14 +61,14 @@
         <w:tblLook w:val="04A0" w:firstRow="1" w:lastRow="0" w:firstColumn="1" w:lastColumn="0" w:noHBand="0" w:noVBand="1"/>
       </w:tblPr>
       <w:tblGrid>
-        <w:gridCol w:w="878"/>
-        <w:gridCol w:w="1598"/>
-        <w:gridCol w:w="1346"/>
-        <w:gridCol w:w="1611"/>
-        <w:gridCol w:w="1249"/>
-        <w:gridCol w:w="1713"/>
-        <w:gridCol w:w="1249"/>
-        <w:gridCol w:w="1392"/>
+        <w:gridCol w:w="866"/>
+        <w:gridCol w:w="1576"/>
+        <w:gridCol w:w="1328"/>
+        <w:gridCol w:w="1589"/>
+        <w:gridCol w:w="1383"/>
+        <w:gridCol w:w="1689"/>
+        <w:gridCol w:w="1232"/>
+        <w:gridCol w:w="1373"/>
       </w:tblGrid>
       <w:tr>
         <w:trPr>
@@ -1977,10 +1977,328 @@
           </w:p>
         </w:tc>
       </w:tr>
+      <w:tr>
+        <w:trPr>
+          <w:trHeight w:val="3676"/>
+        </w:trPr>
+        <w:tc>
+          <w:tcPr>
+            <w:tcW w:w="897" w:type="dxa"/>
+          </w:tcPr>
+          <w:p>
+            <w:pPr>
+              <w:jc w:val="center"/>
+              <w:rPr>
+                <w:rFonts w:ascii="Cambria" w:hAnsi="Cambria" w:cs="Arial"/>
+                <w:sz w:val="24"/>
+                <w:szCs w:val="24"/>
+              </w:rPr>
+            </w:pPr>
+            <w:r>
+              <w:rPr>
+                <w:rFonts w:ascii="Cambria" w:hAnsi="Cambria" w:cs="Arial"/>
+                <w:sz w:val="24"/>
+                <w:szCs w:val="24"/>
+              </w:rPr>
+              <w:t>27-6</w:t>
+            </w:r>
+          </w:p>
+        </w:tc>
+        <w:tc>
+          <w:tcPr>
+            <w:tcW w:w="1653" w:type="dxa"/>
+          </w:tcPr>
+          <w:p>
+            <w:pPr>
+              <w:jc w:val="center"/>
+              <w:rPr>
+                <w:rFonts w:ascii="Cambria" w:hAnsi="Cambria" w:cs="Arial"/>
+                <w:sz w:val="24"/>
+                <w:szCs w:val="24"/>
+              </w:rPr>
+            </w:pPr>
+            <w:r>
+              <w:rPr>
+                <w:rFonts w:ascii="Cambria" w:hAnsi="Cambria" w:cs="Arial"/>
+                <w:sz w:val="24"/>
+                <w:szCs w:val="24"/>
+              </w:rPr>
+              <w:t>Melvin</w:t>
+            </w:r>
+          </w:p>
+          <w:p>
+            <w:pPr>
+              <w:jc w:val="center"/>
+              <w:rPr>
+                <w:rFonts w:ascii="Cambria" w:hAnsi="Cambria" w:cs="Arial"/>
+                <w:sz w:val="24"/>
+                <w:szCs w:val="24"/>
+              </w:rPr>
+            </w:pPr>
+            <w:r>
+              <w:rPr>
+                <w:rFonts w:ascii="Cambria" w:hAnsi="Cambria" w:cs="Arial"/>
+                <w:sz w:val="24"/>
+                <w:szCs w:val="24"/>
+              </w:rPr>
+              <w:t>Jean Marco</w:t>
+            </w:r>
+          </w:p>
+          <w:p>
+            <w:pPr>
+              <w:jc w:val="center"/>
+              <w:rPr>
+                <w:rFonts w:ascii="Cambria" w:hAnsi="Cambria" w:cs="Arial"/>
+                <w:sz w:val="24"/>
+                <w:szCs w:val="24"/>
+              </w:rPr>
+            </w:pPr>
+            <w:r>
+              <w:rPr>
+                <w:rFonts w:ascii="Cambria" w:hAnsi="Cambria" w:cs="Arial"/>
+                <w:sz w:val="24"/>
+                <w:szCs w:val="24"/>
+              </w:rPr>
+              <w:t>Josimar</w:t>
+            </w:r>
+          </w:p>
+        </w:tc>
+        <w:tc>
+          <w:tcPr>
+            <w:tcW w:w="1389" w:type="dxa"/>
+          </w:tcPr>
+          <w:p>
+            <w:pPr>
+              <w:jc w:val="center"/>
+              <w:rPr>
+                <w:rFonts w:ascii="Cambria" w:hAnsi="Cambria" w:cs="Arial"/>
+                <w:sz w:val="24"/>
+                <w:szCs w:val="24"/>
+              </w:rPr>
+            </w:pPr>
+            <w:r>
+              <w:rPr>
+                <w:rFonts w:ascii="Cambria" w:hAnsi="Cambria" w:cs="Arial"/>
+                <w:sz w:val="24"/>
+                <w:szCs w:val="24"/>
+              </w:rPr>
+              <w:t>Mejoras finales</w:t>
+            </w:r>
+          </w:p>
+        </w:tc>
+        <w:tc>
+          <w:tcPr>
+            <w:tcW w:w="1552" w:type="dxa"/>
+          </w:tcPr>
+          <w:p>
+            <w:pPr>
+              <w:jc w:val="center"/>
+              <w:rPr>
+                <w:rFonts w:ascii="Cambria" w:hAnsi="Cambria" w:cs="Arial"/>
+                <w:sz w:val="24"/>
+                <w:szCs w:val="24"/>
+              </w:rPr>
+            </w:pPr>
+            <w:r>
+              <w:rPr>
+                <w:rFonts w:ascii="Cambria" w:hAnsi="Cambria" w:cs="Arial"/>
+                <w:sz w:val="24"/>
+                <w:szCs w:val="24"/>
+              </w:rPr>
+              <w:t>Josimar acabó los trabajos en el backend</w:t>
+            </w:r>
+          </w:p>
+          <w:p>
+            <w:pPr>
+              <w:jc w:val="center"/>
+              <w:rPr>
+                <w:rFonts w:ascii="Cambria" w:hAnsi="Cambria" w:cs="Arial"/>
+                <w:sz w:val="24"/>
+                <w:szCs w:val="24"/>
+              </w:rPr>
+            </w:pPr>
+            <w:r>
+              <w:rPr>
+                <w:rFonts w:ascii="Cambria" w:hAnsi="Cambria" w:cs="Arial"/>
+                <w:sz w:val="24"/>
+                <w:szCs w:val="24"/>
+              </w:rPr>
+              <w:t>Melvin siguió con su trabajo de todo el HTML mejorando en gran medida la parte estética y funcional</w:t>
+            </w:r>
+          </w:p>
+          <w:p>
+            <w:pPr>
+              <w:jc w:val="center"/>
+              <w:rPr>
+                <w:rFonts w:ascii="Cambria" w:hAnsi="Cambria" w:cs="Arial"/>
+                <w:sz w:val="24"/>
+                <w:szCs w:val="24"/>
+              </w:rPr>
+            </w:pPr>
+            <w:r>
+              <w:rPr>
+                <w:rFonts w:ascii="Cambria" w:hAnsi="Cambria" w:cs="Arial"/>
+                <w:sz w:val="24"/>
+                <w:szCs w:val="24"/>
+              </w:rPr>
+              <w:t>Jean Marco verificó y trabajó en las conexiones a Neón y render</w:t>
+            </w:r>
+          </w:p>
+        </w:tc>
+        <w:tc>
+          <w:tcPr>
+            <w:tcW w:w="1287" w:type="dxa"/>
+          </w:tcPr>
+          <w:p>
+            <w:pPr>
+              <w:jc w:val="center"/>
+              <w:rPr>
+                <w:rFonts w:ascii="Cambria" w:hAnsi="Cambria" w:cs="Arial"/>
+                <w:sz w:val="24"/>
+                <w:szCs w:val="24"/>
+              </w:rPr>
+            </w:pPr>
+            <w:r>
+              <w:rPr>
+                <w:rFonts w:ascii="Cambria" w:hAnsi="Cambria" w:cs="Arial"/>
+                <w:sz w:val="24"/>
+                <w:szCs w:val="24"/>
+              </w:rPr>
+              <w:t>Se logró todo lo mencióname en las tareas realizadas</w:t>
+            </w:r>
+          </w:p>
+        </w:tc>
+        <w:tc>
+          <w:tcPr>
+            <w:tcW w:w="1546" w:type="dxa"/>
+          </w:tcPr>
+          <w:p>
+            <w:pPr>
+              <w:jc w:val="center"/>
+              <w:rPr>
+                <w:rFonts w:ascii="Cambria" w:hAnsi="Cambria" w:cs="Arial"/>
+                <w:sz w:val="24"/>
+                <w:szCs w:val="24"/>
+              </w:rPr>
+            </w:pPr>
+            <w:r>
+              <w:rPr>
+                <w:rFonts w:ascii="Cambria" w:hAnsi="Cambria" w:cs="Arial"/>
+                <w:sz w:val="24"/>
+                <w:szCs w:val="24"/>
+              </w:rPr>
+              <w:t>Dificultades con la estilización del HTML</w:t>
+            </w:r>
+          </w:p>
+        </w:tc>
+        <w:tc>
+          <w:tcPr>
+            <w:tcW w:w="1274" w:type="dxa"/>
+          </w:tcPr>
+          <w:p>
+            <w:pPr>
+              <w:jc w:val="center"/>
+              <w:rPr>
+                <w:rFonts w:ascii="Cambria" w:hAnsi="Cambria" w:cs="Arial"/>
+                <w:sz w:val="24"/>
+                <w:szCs w:val="24"/>
+              </w:rPr>
+            </w:pPr>
+            <w:r>
+              <w:rPr>
+                <w:rFonts w:ascii="Cambria" w:hAnsi="Cambria" w:cs="Arial"/>
+                <w:sz w:val="24"/>
+                <w:szCs w:val="24"/>
+              </w:rPr>
+              <w:t>Una vez acabado todo eso, se proceder a subir todo a render y hacer conexiones para empezar a hacer pruebas</w:t>
+            </w:r>
+          </w:p>
+        </w:tc>
+        <w:tc>
+          <w:tcPr>
+            <w:tcW w:w="1437" w:type="dxa"/>
+          </w:tcPr>
+          <w:p>
+            <w:pPr>
+              <w:jc w:val="center"/>
+              <w:rPr>
+                <w:rFonts w:ascii="Cambria" w:hAnsi="Cambria" w:cs="Arial"/>
+                <w:sz w:val="24"/>
+                <w:szCs w:val="24"/>
+              </w:rPr>
+            </w:pPr>
+            <w:r>
+              <w:rPr>
+                <w:rFonts w:ascii="Cambria" w:hAnsi="Cambria" w:cs="Arial"/>
+                <w:sz w:val="24"/>
+                <w:szCs w:val="24"/>
+              </w:rPr>
+              <w:t>Melvin excelente</w:t>
+            </w:r>
+          </w:p>
+          <w:p>
+            <w:pPr>
+              <w:jc w:val="center"/>
+              <w:rPr>
+                <w:rFonts w:ascii="Cambria" w:hAnsi="Cambria" w:cs="Arial"/>
+                <w:sz w:val="24"/>
+                <w:szCs w:val="24"/>
+              </w:rPr>
+            </w:pPr>
+          </w:p>
+          <w:p>
+            <w:pPr>
+              <w:jc w:val="center"/>
+              <w:rPr>
+                <w:rFonts w:ascii="Cambria" w:hAnsi="Cambria" w:cs="Arial"/>
+                <w:sz w:val="24"/>
+                <w:szCs w:val="24"/>
+              </w:rPr>
+            </w:pPr>
+            <w:r>
+              <w:rPr>
+                <w:rFonts w:ascii="Cambria" w:hAnsi="Cambria" w:cs="Arial"/>
+                <w:sz w:val="24"/>
+                <w:szCs w:val="24"/>
+              </w:rPr>
+              <w:t>Jean y Jossimar adecuado</w:t>
+            </w:r>
+          </w:p>
+          <w:p>
+            <w:pPr>
+              <w:jc w:val="center"/>
+              <w:rPr>
+                <w:rFonts w:ascii="Cambria" w:hAnsi="Cambria" w:cs="Arial"/>
+                <w:sz w:val="24"/>
+                <w:szCs w:val="24"/>
+              </w:rPr>
+            </w:pPr>
+          </w:p>
+          <w:p>
+            <w:pPr>
+              <w:jc w:val="center"/>
+              <w:rPr>
+                <w:rFonts w:ascii="Cambria" w:hAnsi="Cambria" w:cs="Arial"/>
+                <w:sz w:val="24"/>
+                <w:szCs w:val="24"/>
+              </w:rPr>
+            </w:pPr>
+            <w:r>
+              <w:rPr>
+                <w:rFonts w:ascii="Cambria" w:hAnsi="Cambria" w:cs="Arial"/>
+                <w:sz w:val="24"/>
+                <w:szCs w:val="24"/>
+              </w:rPr>
+              <w:t>Allan y Carlos insuficiente</w:t>
+            </w:r>
+          </w:p>
+        </w:tc>
+      </w:tr>
     </w:tbl>
     <w:p/>
     <w:p>
       <w:r>
+        <w:lastRenderedPageBreak/>
         <w:br/>
       </w:r>
     </w:p>

</xml_diff>